<commit_message>
transfer to dell 台式机
</commit_message>
<xml_diff>
--- a/MS/molecular ecology之后/重写备忘录.docx
+++ b/MS/molecular ecology之后/重写备忘录.docx
@@ -1,6 +1,6 @@
 
 <file path=word/document.xml><?xml version="1.0" encoding="utf-8"?>
-<w:document xmlns:wpc="http://schemas.microsoft.com/office/word/2010/wordprocessingCanvas" xmlns:cx="http://schemas.microsoft.com/office/drawing/2014/chartex" xmlns:cx1="http://schemas.microsoft.com/office/drawing/2015/9/8/chartex" xmlns:cx2="http://schemas.microsoft.com/office/drawing/2015/10/21/chartex" xmlns:cx3="http://schemas.microsoft.com/office/drawing/2016/5/9/chartex" xmlns:cx4="http://schemas.microsoft.com/office/drawing/2016/5/10/chartex" xmlns:cx5="http://schemas.microsoft.com/office/drawing/2016/5/11/chartex" xmlns:cx6="http://schemas.microsoft.com/office/drawing/2016/5/12/chartex" xmlns:cx7="http://schemas.microsoft.com/office/drawing/2016/5/13/chartex" xmlns:cx8="http://schemas.microsoft.com/office/drawing/2016/5/14/chartex" xmlns:mc="http://schemas.openxmlformats.org/markup-compatibility/2006" xmlns:aink="http://schemas.microsoft.com/office/drawing/2016/ink" xmlns:am3d="http://schemas.microsoft.com/office/drawing/2017/model3d" xmlns:o="urn:schemas-microsoft-com:office:office" xmlns:r="http://schemas.openxmlformats.org/officeDocument/2006/relationships" xmlns:m="http://schemas.openxmlformats.org/officeDocument/2006/math" xmlns:v="urn:schemas-microsoft-com:vml" xmlns:wp14="http://schemas.microsoft.com/office/word/2010/wordprocessingDrawing" xmlns:wp="http://schemas.openxmlformats.org/drawingml/2006/wordprocessingDrawing" xmlns:w10="urn:schemas-microsoft-com:office:word" xmlns:w="http://schemas.openxmlformats.org/wordprocessingml/2006/main" xmlns:w14="http://schemas.microsoft.com/office/word/2010/wordml" xmlns:w15="http://schemas.microsoft.com/office/word/2012/wordml" xmlns:w16cid="http://schemas.microsoft.com/office/word/2016/wordml/cid" xmlns:w16se="http://schemas.microsoft.com/office/word/2015/wordml/symex" xmlns:wpg="http://schemas.microsoft.com/office/word/2010/wordprocessingGroup" xmlns:wpi="http://schemas.microsoft.com/office/word/2010/wordprocessingInk" xmlns:wne="http://schemas.microsoft.com/office/word/2006/wordml" xmlns:wps="http://schemas.microsoft.com/office/word/2010/wordprocessingShape" mc:Ignorable="w14 w15 w16se w16cid wp14">
+<w:document xmlns:wpc="http://schemas.microsoft.com/office/word/2010/wordprocessingCanvas" xmlns:cx="http://schemas.microsoft.com/office/drawing/2014/chartex" xmlns:cx1="http://schemas.microsoft.com/office/drawing/2015/9/8/chartex" xmlns:cx2="http://schemas.microsoft.com/office/drawing/2015/10/21/chartex" xmlns:cx3="http://schemas.microsoft.com/office/drawing/2016/5/9/chartex" xmlns:cx4="http://schemas.microsoft.com/office/drawing/2016/5/10/chartex" xmlns:cx5="http://schemas.microsoft.com/office/drawing/2016/5/11/chartex" xmlns:cx6="http://schemas.microsoft.com/office/drawing/2016/5/12/chartex" xmlns:cx7="http://schemas.microsoft.com/office/drawing/2016/5/13/chartex" xmlns:cx8="http://schemas.microsoft.com/office/drawing/2016/5/14/chartex" xmlns:mc="http://schemas.openxmlformats.org/markup-compatibility/2006" xmlns:aink="http://schemas.microsoft.com/office/drawing/2016/ink" xmlns:am3d="http://schemas.microsoft.com/office/drawing/2017/model3d" xmlns:o="urn:schemas-microsoft-com:office:office" xmlns:r="http://schemas.openxmlformats.org/officeDocument/2006/relationships" xmlns:m="http://schemas.openxmlformats.org/officeDocument/2006/math" xmlns:v="urn:schemas-microsoft-com:vml" xmlns:wp14="http://schemas.microsoft.com/office/word/2010/wordprocessingDrawing" xmlns:wp="http://schemas.openxmlformats.org/drawingml/2006/wordprocessingDrawing" xmlns:w10="urn:schemas-microsoft-com:office:word" xmlns:w="http://schemas.openxmlformats.org/wordprocessingml/2006/main" xmlns:w14="http://schemas.microsoft.com/office/word/2010/wordml" xmlns:w15="http://schemas.microsoft.com/office/word/2012/wordml" xmlns:w16cex="http://schemas.microsoft.com/office/word/2018/wordml/cex" xmlns:w16cid="http://schemas.microsoft.com/office/word/2016/wordml/cid" xmlns:w16="http://schemas.microsoft.com/office/word/2018/wordml" xmlns:w16sdtdh="http://schemas.microsoft.com/office/word/2020/wordml/sdtdatahash" xmlns:w16se="http://schemas.microsoft.com/office/word/2015/wordml/symex" xmlns:wpg="http://schemas.microsoft.com/office/word/2010/wordprocessingGroup" xmlns:wpi="http://schemas.microsoft.com/office/word/2010/wordprocessingInk" xmlns:wne="http://schemas.microsoft.com/office/word/2006/wordml" xmlns:wps="http://schemas.microsoft.com/office/word/2010/wordprocessingShape" mc:Ignorable="w14 w15 w16se w16cid w16 w16cex w16sdtdh wp14">
   <w:body>
     <w:p>
       <w:pPr>
@@ -18,187 +18,7 @@
           <w:szCs w:val="21"/>
           <w:shd w:val="clear" w:color="auto" w:fill="FFFFFF"/>
         </w:rPr>
-        <w:t>传统的观点认为家鸭是起源于绿头野鸭或绿头野鸭</w:t>
-      </w:r>
-      <w:proofErr w:type="gramStart"/>
-      <w:r>
-        <w:rPr>
-          <w:rFonts w:ascii="宋体" w:eastAsia="宋体" w:hAnsi="宋体" w:cs="Arial"/>
-          <w:color w:val="000000"/>
-          <w:szCs w:val="21"/>
-          <w:shd w:val="clear" w:color="auto" w:fill="FFFFFF"/>
-        </w:rPr>
-        <w:t>和斑嘴野鸭</w:t>
-      </w:r>
-      <w:proofErr w:type="gramEnd"/>
-      <w:r>
-        <w:rPr>
-          <w:rFonts w:ascii="宋体" w:eastAsia="宋体" w:hAnsi="宋体" w:cs="Arial"/>
-          <w:color w:val="000000"/>
-          <w:szCs w:val="21"/>
-          <w:shd w:val="clear" w:color="auto" w:fill="FFFFFF"/>
-        </w:rPr>
-        <w:t>的杂交后代，这个依据主要是外形及习性的相似以及栖息地的分布。关于驯化（主要是动物），传统的观点认为是由人类主导的选择野生动物驯养并演化成为驯化动物的过程。但是越来越多的研究发现传统的驯化假设和遗传数据并不相符。我们通过PCA，IBS进化树等分析发现相较于其他野鸭品种，绿头野鸭</w:t>
-      </w:r>
-      <w:proofErr w:type="gramStart"/>
-      <w:r>
-        <w:rPr>
-          <w:rFonts w:ascii="宋体" w:eastAsia="宋体" w:hAnsi="宋体" w:cs="Arial"/>
-          <w:color w:val="000000"/>
-          <w:szCs w:val="21"/>
-          <w:shd w:val="clear" w:color="auto" w:fill="FFFFFF"/>
-        </w:rPr>
-        <w:t>和斑嘴野鸭</w:t>
-      </w:r>
-      <w:proofErr w:type="gramEnd"/>
-      <w:r>
-        <w:rPr>
-          <w:rFonts w:ascii="宋体" w:eastAsia="宋体" w:hAnsi="宋体" w:cs="Arial"/>
-          <w:color w:val="000000"/>
-          <w:szCs w:val="21"/>
-          <w:shd w:val="clear" w:color="auto" w:fill="FFFFFF"/>
-        </w:rPr>
-        <w:t>确实在遗传特征上和家鸭更为相似，进化关系也更接近。但是F3统计量分析并不支持家鸭是绿头</w:t>
-      </w:r>
-      <w:proofErr w:type="gramStart"/>
-      <w:r>
-        <w:rPr>
-          <w:rFonts w:ascii="宋体" w:eastAsia="宋体" w:hAnsi="宋体" w:cs="Arial"/>
-          <w:color w:val="000000"/>
-          <w:szCs w:val="21"/>
-          <w:shd w:val="clear" w:color="auto" w:fill="FFFFFF"/>
-        </w:rPr>
-        <w:t>和斑嘴杂交</w:t>
-      </w:r>
-      <w:proofErr w:type="gramEnd"/>
-      <w:r>
-        <w:rPr>
-          <w:rFonts w:ascii="宋体" w:eastAsia="宋体" w:hAnsi="宋体" w:cs="Arial"/>
-          <w:color w:val="000000"/>
-          <w:szCs w:val="21"/>
-          <w:shd w:val="clear" w:color="auto" w:fill="FFFFFF"/>
-        </w:rPr>
-        <w:t>后代的假设，然而进化关系尤其是SNP分布的分析却表明家鸭和野鸭具有相比拟的亲缘关系。进而通过genetic structure的分析发现绿头野鸭</w:t>
-      </w:r>
-      <w:proofErr w:type="gramStart"/>
-      <w:r>
-        <w:rPr>
-          <w:rFonts w:ascii="宋体" w:eastAsia="宋体" w:hAnsi="宋体" w:cs="Arial"/>
-          <w:color w:val="000000"/>
-          <w:szCs w:val="21"/>
-          <w:shd w:val="clear" w:color="auto" w:fill="FFFFFF"/>
-        </w:rPr>
-        <w:t>和斑嘴野鸭</w:t>
-      </w:r>
-      <w:proofErr w:type="gramEnd"/>
-      <w:r>
-        <w:rPr>
-          <w:rFonts w:ascii="宋体" w:eastAsia="宋体" w:hAnsi="宋体" w:cs="Arial"/>
-          <w:color w:val="000000"/>
-          <w:szCs w:val="21"/>
-          <w:shd w:val="clear" w:color="auto" w:fill="FFFFFF"/>
-        </w:rPr>
-        <w:t>的分化可能晚于他们的祖先和家鸭祖先的分化，而这一进化关系逻辑上也可以满足包括F3统计量和SNP分布在内的前述分析结果。进而我们通过</w:t>
-      </w:r>
-      <w:proofErr w:type="spellStart"/>
-      <w:r>
-        <w:rPr>
-          <w:rFonts w:ascii="宋体" w:eastAsia="宋体" w:hAnsi="宋体" w:cs="Arial"/>
-          <w:color w:val="000000"/>
-          <w:szCs w:val="21"/>
-          <w:shd w:val="clear" w:color="auto" w:fill="FFFFFF"/>
-        </w:rPr>
-        <w:t>dadi</w:t>
-      </w:r>
-      <w:proofErr w:type="spellEnd"/>
-      <w:r>
-        <w:rPr>
-          <w:rFonts w:ascii="宋体" w:eastAsia="宋体" w:hAnsi="宋体" w:cs="Arial"/>
-          <w:color w:val="000000"/>
-          <w:szCs w:val="21"/>
-          <w:shd w:val="clear" w:color="auto" w:fill="FFFFFF"/>
-        </w:rPr>
-        <w:t>模拟群体历史，结果支持了家鸭祖先和野鸭祖先</w:t>
-      </w:r>
-      <w:proofErr w:type="gramStart"/>
-      <w:r>
-        <w:rPr>
-          <w:rFonts w:ascii="宋体" w:eastAsia="宋体" w:hAnsi="宋体" w:cs="Arial"/>
-          <w:color w:val="000000"/>
-          <w:szCs w:val="21"/>
-          <w:shd w:val="clear" w:color="auto" w:fill="FFFFFF"/>
-        </w:rPr>
-        <w:t>先</w:t>
-      </w:r>
-      <w:proofErr w:type="gramEnd"/>
-      <w:r>
-        <w:rPr>
-          <w:rFonts w:ascii="宋体" w:eastAsia="宋体" w:hAnsi="宋体" w:cs="Arial"/>
-          <w:color w:val="000000"/>
-          <w:szCs w:val="21"/>
-          <w:shd w:val="clear" w:color="auto" w:fill="FFFFFF"/>
-        </w:rPr>
-        <w:t>分化，野鸭再分化为绿头</w:t>
-      </w:r>
-      <w:proofErr w:type="gramStart"/>
-      <w:r>
-        <w:rPr>
-          <w:rFonts w:ascii="宋体" w:eastAsia="宋体" w:hAnsi="宋体" w:cs="Arial"/>
-          <w:color w:val="000000"/>
-          <w:szCs w:val="21"/>
-          <w:shd w:val="clear" w:color="auto" w:fill="FFFFFF"/>
-        </w:rPr>
-        <w:t>和斑嘴的</w:t>
-      </w:r>
-      <w:proofErr w:type="gramEnd"/>
-      <w:r>
-        <w:rPr>
-          <w:rFonts w:ascii="宋体" w:eastAsia="宋体" w:hAnsi="宋体" w:cs="Arial"/>
-          <w:color w:val="000000"/>
-          <w:szCs w:val="21"/>
-          <w:shd w:val="clear" w:color="auto" w:fill="FFFFFF"/>
-        </w:rPr>
-        <w:t>假设。同时PSMC的分析暗示出野鸭和家鸭分化的时间和</w:t>
-      </w:r>
-      <w:proofErr w:type="spellStart"/>
-      <w:r>
-        <w:rPr>
-          <w:rFonts w:ascii="宋体" w:eastAsia="宋体" w:hAnsi="宋体" w:cs="Arial"/>
-          <w:color w:val="000000"/>
-          <w:szCs w:val="21"/>
-          <w:shd w:val="clear" w:color="auto" w:fill="FFFFFF"/>
-        </w:rPr>
-        <w:t>dadi</w:t>
-      </w:r>
-      <w:proofErr w:type="spellEnd"/>
-      <w:r>
-        <w:rPr>
-          <w:rFonts w:ascii="宋体" w:eastAsia="宋体" w:hAnsi="宋体" w:cs="Arial"/>
-          <w:color w:val="000000"/>
-          <w:szCs w:val="21"/>
-          <w:shd w:val="clear" w:color="auto" w:fill="FFFFFF"/>
-        </w:rPr>
-        <w:t>模拟得出的时间相吻合，PSMC还显示出野鸭在与家鸭祖先分化之后群体大小持续降低，随后</w:t>
-      </w:r>
-      <w:proofErr w:type="spellStart"/>
-      <w:r>
-        <w:rPr>
-          <w:rFonts w:ascii="宋体" w:eastAsia="宋体" w:hAnsi="宋体" w:cs="Arial"/>
-          <w:color w:val="000000"/>
-          <w:szCs w:val="21"/>
-          <w:shd w:val="clear" w:color="auto" w:fill="FFFFFF"/>
-        </w:rPr>
-        <w:t>dadi</w:t>
-      </w:r>
-      <w:proofErr w:type="spellEnd"/>
-      <w:r>
-        <w:rPr>
-          <w:rFonts w:ascii="宋体" w:eastAsia="宋体" w:hAnsi="宋体" w:cs="Arial"/>
-          <w:color w:val="000000"/>
-          <w:szCs w:val="21"/>
-          <w:shd w:val="clear" w:color="auto" w:fill="FFFFFF"/>
-        </w:rPr>
-        <w:t>的模拟显示出和PSMC相同的群体大小变化趋势。 </w:t>
+        <w:t>传统的观点认为家鸭是起源于绿头野鸭或绿头野鸭和斑嘴野鸭的杂交后代，这个依据主要是外形及习性的相似以及栖息地的分布。关于驯化（主要是动物），传统的观点认为是由人类主导的选择野生动物驯养并演化成为驯化动物的过程。但是越来越多的研究发现传统的驯化假设和遗传数据并不相符。我们通过PCA，IBS进化树等分析发现相较于其他野鸭品种，绿头野鸭和斑嘴野鸭确实在遗传特征上和家鸭更为相似，进化关系也更接近。但是F3统计量分析并不支持家鸭是绿头和斑嘴杂交后代的假设，然而进化关系尤其是SNP分布的分析却表明家鸭和野鸭具有相比拟的亲缘关系。进而通过genetic structure的分析发现绿头野鸭和斑嘴野鸭的分化可能晚于他们的祖先和家鸭祖先的分化，而这一进化关系逻辑上也可以满足包括F3统计量和SNP分布在内的前述分析结果。进而我们通过dadi模拟群体历史，结果支持了家鸭祖先和野鸭祖先先分化，野鸭再分化为绿头和斑嘴的假设。同时PSMC的分析暗示出野鸭和家鸭分化的时间和dadi模拟得出的时间相吻合，PSMC还显示出野鸭在与家鸭祖先分化之后群体大小持续降低，随后dadi的模拟显示出和PSMC相同的群体大小变化趋势。 </w:t>
       </w:r>
     </w:p>
     <w:p>
@@ -339,9 +159,18 @@
           <w:szCs w:val="21"/>
           <w:shd w:val="clear" w:color="auto" w:fill="FFFFFF"/>
         </w:rPr>
-        <w:t>类型，这个工作相对耗时而且复杂，因此，打算先将就</w:t>
-      </w:r>
-      <w:proofErr w:type="gramStart"/>
+        <w:t>类型，这个工作相对耗时而且复杂，因此，打算先将就用之前的结果，投文章同时进行重新分析！</w:t>
+      </w:r>
+    </w:p>
+    <w:p>
+      <w:pPr>
+        <w:rPr>
+          <w:rFonts w:ascii="宋体" w:eastAsia="宋体" w:hAnsi="宋体" w:cs="Arial"/>
+          <w:color w:val="000000"/>
+          <w:szCs w:val="21"/>
+          <w:shd w:val="clear" w:color="auto" w:fill="FFFFFF"/>
+        </w:rPr>
+      </w:pPr>
       <w:r>
         <w:rPr>
           <w:rFonts w:ascii="宋体" w:eastAsia="宋体" w:hAnsi="宋体" w:cs="Arial" w:hint="eastAsia"/>
@@ -349,9 +178,17 @@
           <w:szCs w:val="21"/>
           <w:shd w:val="clear" w:color="auto" w:fill="FFFFFF"/>
         </w:rPr>
-        <w:t>用之前</w:t>
-      </w:r>
-      <w:proofErr w:type="gramEnd"/>
+        <w:t>发现原在黄的服务器上的</w:t>
+      </w:r>
+      <w:r>
+        <w:rPr>
+          <w:rFonts w:ascii="宋体" w:eastAsia="宋体" w:hAnsi="宋体" w:cs="Arial"/>
+          <w:color w:val="000000"/>
+          <w:szCs w:val="21"/>
+          <w:shd w:val="clear" w:color="auto" w:fill="FFFFFF"/>
+        </w:rPr>
+        <w:t>mysql</w:t>
+      </w:r>
       <w:r>
         <w:rPr>
           <w:rFonts w:ascii="宋体" w:eastAsia="宋体" w:hAnsi="宋体" w:cs="Arial" w:hint="eastAsia"/>
@@ -359,9 +196,18 @@
           <w:szCs w:val="21"/>
           <w:shd w:val="clear" w:color="auto" w:fill="FFFFFF"/>
         </w:rPr>
-        <w:t>的结果，</w:t>
-      </w:r>
-      <w:proofErr w:type="gramStart"/>
+        <w:t>数据已经完全被清除了，所以重新分析的步骤为：</w:t>
+      </w:r>
+    </w:p>
+    <w:p>
+      <w:pPr>
+        <w:rPr>
+          <w:rFonts w:ascii="宋体" w:eastAsia="宋体" w:hAnsi="宋体" w:cs="Arial"/>
+          <w:color w:val="000000"/>
+          <w:szCs w:val="21"/>
+          <w:shd w:val="clear" w:color="auto" w:fill="FFFFFF"/>
+        </w:rPr>
+      </w:pPr>
       <w:r>
         <w:rPr>
           <w:rFonts w:ascii="宋体" w:eastAsia="宋体" w:hAnsi="宋体" w:cs="Arial" w:hint="eastAsia"/>
@@ -369,9 +215,26 @@
           <w:szCs w:val="21"/>
           <w:shd w:val="clear" w:color="auto" w:fill="FFFFFF"/>
         </w:rPr>
-        <w:t>投文章</w:t>
-      </w:r>
-      <w:proofErr w:type="gramEnd"/>
+        <w:t>用</w:t>
+      </w:r>
+      <w:r>
+        <w:rPr>
+          <w:rFonts w:ascii="宋体" w:eastAsia="宋体" w:hAnsi="宋体" w:cs="Arial"/>
+          <w:color w:val="000000"/>
+          <w:szCs w:val="21"/>
+          <w:shd w:val="clear" w:color="auto" w:fill="FFFFFF"/>
+        </w:rPr>
+        <w:t>/home/liurui/data/olddatafrom94/uniqmap/pool/p_m_sx_sp_gy_kbe_sm_lcb_ytg_jd_10pool10.SNV.vcf</w:t>
+      </w:r>
+      <w:r>
+        <w:rPr>
+          <w:rFonts w:ascii="宋体" w:eastAsia="宋体" w:hAnsi="宋体" w:cs="Arial"/>
+          <w:color w:val="000000"/>
+          <w:szCs w:val="21"/>
+          <w:shd w:val="clear" w:color="auto" w:fill="FFFFFF"/>
+        </w:rPr>
+        <w:t xml:space="preserve"> </w:t>
+      </w:r>
       <w:r>
         <w:rPr>
           <w:rFonts w:ascii="宋体" w:eastAsia="宋体" w:hAnsi="宋体" w:cs="Arial" w:hint="eastAsia"/>
@@ -379,18 +242,17 @@
           <w:szCs w:val="21"/>
           <w:shd w:val="clear" w:color="auto" w:fill="FFFFFF"/>
         </w:rPr>
-        <w:t>同时进行重新分析！</w:t>
-      </w:r>
-    </w:p>
-    <w:p>
-      <w:pPr>
+        <w:t>制作m</w:t>
+      </w:r>
+      <w:r>
         <w:rPr>
           <w:rFonts w:ascii="宋体" w:eastAsia="宋体" w:hAnsi="宋体" w:cs="Arial"/>
           <w:color w:val="000000"/>
           <w:szCs w:val="21"/>
           <w:shd w:val="clear" w:color="auto" w:fill="FFFFFF"/>
         </w:rPr>
-      </w:pPr>
+        <w:t xml:space="preserve">ysql </w:t>
+      </w:r>
       <w:r>
         <w:rPr>
           <w:rFonts w:ascii="宋体" w:eastAsia="宋体" w:hAnsi="宋体" w:cs="Arial" w:hint="eastAsia"/>
@@ -398,9 +260,8 @@
           <w:szCs w:val="21"/>
           <w:shd w:val="clear" w:color="auto" w:fill="FFFFFF"/>
         </w:rPr>
-        <w:t>发现原在黄的服务器上的</w:t>
-      </w:r>
-      <w:proofErr w:type="spellStart"/>
+        <w:t>da</w:t>
+      </w:r>
       <w:r>
         <w:rPr>
           <w:rFonts w:ascii="宋体" w:eastAsia="宋体" w:hAnsi="宋体" w:cs="Arial"/>
@@ -408,9 +269,18 @@
           <w:szCs w:val="21"/>
           <w:shd w:val="clear" w:color="auto" w:fill="FFFFFF"/>
         </w:rPr>
-        <w:t>mysql</w:t>
-      </w:r>
-      <w:proofErr w:type="spellEnd"/>
+        <w:t>tabases,</w:t>
+      </w:r>
+    </w:p>
+    <w:p>
+      <w:pPr>
+        <w:rPr>
+          <w:rFonts w:ascii="宋体" w:eastAsia="宋体" w:hAnsi="宋体" w:cs="Arial"/>
+          <w:color w:val="000000"/>
+          <w:szCs w:val="21"/>
+          <w:shd w:val="clear" w:color="auto" w:fill="FFFFFF"/>
+        </w:rPr>
+      </w:pPr>
       <w:r>
         <w:rPr>
           <w:rFonts w:ascii="宋体" w:eastAsia="宋体" w:hAnsi="宋体" w:cs="Arial" w:hint="eastAsia"/>
@@ -418,18 +288,17 @@
           <w:szCs w:val="21"/>
           <w:shd w:val="clear" w:color="auto" w:fill="FFFFFF"/>
         </w:rPr>
-        <w:t>数据已经完全被清除了，所以重新分析的步骤为：</w:t>
-      </w:r>
-    </w:p>
-    <w:p>
-      <w:pPr>
+        <w:t>再得到a</w:t>
+      </w:r>
+      <w:r>
         <w:rPr>
           <w:rFonts w:ascii="宋体" w:eastAsia="宋体" w:hAnsi="宋体" w:cs="Arial"/>
           <w:color w:val="000000"/>
           <w:szCs w:val="21"/>
           <w:shd w:val="clear" w:color="auto" w:fill="FFFFFF"/>
         </w:rPr>
-      </w:pPr>
+        <w:t>ncestral allele</w:t>
+      </w:r>
       <w:r>
         <w:rPr>
           <w:rFonts w:ascii="宋体" w:eastAsia="宋体" w:hAnsi="宋体" w:cs="Arial" w:hint="eastAsia"/>
@@ -437,16 +306,26 @@
           <w:szCs w:val="21"/>
           <w:shd w:val="clear" w:color="auto" w:fill="FFFFFF"/>
         </w:rPr>
-        <w:t>用</w:t>
-      </w:r>
-      <w:r>
+        <w:t>类型</w:t>
+      </w:r>
+    </w:p>
+    <w:p>
+      <w:pPr>
         <w:rPr>
           <w:rFonts w:ascii="宋体" w:eastAsia="宋体" w:hAnsi="宋体" w:cs="Arial"/>
           <w:color w:val="000000"/>
           <w:szCs w:val="21"/>
           <w:shd w:val="clear" w:color="auto" w:fill="FFFFFF"/>
         </w:rPr>
-        <w:t>/home/liurui/data/olddatafrom94/uniqmap/pool/p_m_sx_sp_gy_kbe_sm_lcb_ytg_jd_10pool10.SNV.vcf</w:t>
+      </w:pPr>
+      <w:r>
+        <w:rPr>
+          <w:rFonts w:ascii="宋体" w:eastAsia="宋体" w:hAnsi="宋体" w:cs="Arial" w:hint="eastAsia"/>
+          <w:color w:val="000000"/>
+          <w:szCs w:val="21"/>
+          <w:shd w:val="clear" w:color="auto" w:fill="FFFFFF"/>
+        </w:rPr>
+        <w:t>再c</w:t>
       </w:r>
       <w:r>
         <w:rPr>
@@ -455,7 +334,7 @@
           <w:szCs w:val="21"/>
           <w:shd w:val="clear" w:color="auto" w:fill="FFFFFF"/>
         </w:rPr>
-        <w:t xml:space="preserve"> </w:t>
+        <w:t>all</w:t>
       </w:r>
       <w:r>
         <w:rPr>
@@ -464,9 +343,18 @@
           <w:szCs w:val="21"/>
           <w:shd w:val="clear" w:color="auto" w:fill="FFFFFF"/>
         </w:rPr>
-        <w:t>制作</w:t>
-      </w:r>
-      <w:proofErr w:type="spellStart"/>
+        <w:t>早期选择（自动添加野鸭的位点）</w:t>
+      </w:r>
+    </w:p>
+    <w:p>
+      <w:pPr>
+        <w:rPr>
+          <w:rFonts w:ascii="宋体" w:eastAsia="宋体" w:hAnsi="宋体" w:cs="Arial"/>
+          <w:color w:val="000000"/>
+          <w:szCs w:val="21"/>
+          <w:shd w:val="clear" w:color="auto" w:fill="FFFFFF"/>
+        </w:rPr>
+      </w:pPr>
       <w:r>
         <w:rPr>
           <w:rFonts w:ascii="宋体" w:eastAsia="宋体" w:hAnsi="宋体" w:cs="Arial" w:hint="eastAsia"/>
@@ -474,7 +362,7 @@
           <w:szCs w:val="21"/>
           <w:shd w:val="clear" w:color="auto" w:fill="FFFFFF"/>
         </w:rPr>
-        <w:t>m</w:t>
+        <w:t>找一下别的v</w:t>
       </w:r>
       <w:r>
         <w:rPr>
@@ -483,18 +371,27 @@
           <w:szCs w:val="21"/>
           <w:shd w:val="clear" w:color="auto" w:fill="FFFFFF"/>
         </w:rPr>
-        <w:t>ysql</w:t>
-      </w:r>
-      <w:proofErr w:type="spellEnd"/>
-      <w:r>
+        <w:t>cf</w:t>
+      </w:r>
+      <w:r>
+        <w:rPr>
+          <w:rFonts w:ascii="宋体" w:eastAsia="宋体" w:hAnsi="宋体" w:cs="Arial" w:hint="eastAsia"/>
+          <w:color w:val="000000"/>
+          <w:szCs w:val="21"/>
+          <w:shd w:val="clear" w:color="auto" w:fill="FFFFFF"/>
+        </w:rPr>
+        <w:t>总数据选最合适的初始化这个表，看一下表的结构。</w:t>
+      </w:r>
+    </w:p>
+    <w:p>
+      <w:pPr>
         <w:rPr>
           <w:rFonts w:ascii="宋体" w:eastAsia="宋体" w:hAnsi="宋体" w:cs="Arial"/>
           <w:color w:val="000000"/>
           <w:szCs w:val="21"/>
           <w:shd w:val="clear" w:color="auto" w:fill="FFFFFF"/>
         </w:rPr>
-        <w:t xml:space="preserve"> </w:t>
-      </w:r>
+      </w:pPr>
       <w:r>
         <w:rPr>
           <w:rFonts w:ascii="宋体" w:eastAsia="宋体" w:hAnsi="宋体" w:cs="Arial" w:hint="eastAsia"/>
@@ -502,7 +399,7 @@
           <w:szCs w:val="21"/>
           <w:shd w:val="clear" w:color="auto" w:fill="FFFFFF"/>
         </w:rPr>
-        <w:t>da</w:t>
+        <w:t>（他妈的f</w:t>
       </w:r>
       <w:r>
         <w:rPr>
@@ -511,18 +408,26 @@
           <w:szCs w:val="21"/>
           <w:shd w:val="clear" w:color="auto" w:fill="FFFFFF"/>
         </w:rPr>
-        <w:t>tabases,</w:t>
-      </w:r>
-    </w:p>
-    <w:p>
-      <w:pPr>
+        <w:t>y</w:t>
+      </w:r>
+      <w:r>
+        <w:rPr>
+          <w:rFonts w:ascii="宋体" w:eastAsia="宋体" w:hAnsi="宋体" w:cs="Arial" w:hint="eastAsia"/>
+          <w:color w:val="000000"/>
+          <w:szCs w:val="21"/>
+          <w:shd w:val="clear" w:color="auto" w:fill="FFFFFF"/>
+        </w:rPr>
+        <w:t>服务器那边突然无法通过h</w:t>
+      </w:r>
+      <w:r>
         <w:rPr>
           <w:rFonts w:ascii="宋体" w:eastAsia="宋体" w:hAnsi="宋体" w:cs="Arial"/>
           <w:color w:val="000000"/>
           <w:szCs w:val="21"/>
           <w:shd w:val="clear" w:color="auto" w:fill="FFFFFF"/>
         </w:rPr>
-      </w:pPr>
+        <w:t>ttp</w:t>
+      </w:r>
       <w:r>
         <w:rPr>
           <w:rFonts w:ascii="宋体" w:eastAsia="宋体" w:hAnsi="宋体" w:cs="Arial" w:hint="eastAsia"/>
@@ -530,7 +435,7 @@
           <w:szCs w:val="21"/>
           <w:shd w:val="clear" w:color="auto" w:fill="FFFFFF"/>
         </w:rPr>
-        <w:t>再得到a</w:t>
+        <w:t>访问my</w:t>
       </w:r>
       <w:r>
         <w:rPr>
@@ -539,7 +444,7 @@
           <w:szCs w:val="21"/>
           <w:shd w:val="clear" w:color="auto" w:fill="FFFFFF"/>
         </w:rPr>
-        <w:t>ncestral allele</w:t>
+        <w:t>sql(sqlyog</w:t>
       </w:r>
       <w:r>
         <w:rPr>
@@ -548,228 +453,17 @@
           <w:szCs w:val="21"/>
           <w:shd w:val="clear" w:color="auto" w:fill="FFFFFF"/>
         </w:rPr>
-        <w:t>类型</w:t>
-      </w:r>
-    </w:p>
-    <w:p>
-      <w:pPr>
+        <w:t>改用了s</w:t>
+      </w:r>
+      <w:r>
         <w:rPr>
           <w:rFonts w:ascii="宋体" w:eastAsia="宋体" w:hAnsi="宋体" w:cs="Arial"/>
           <w:color w:val="000000"/>
           <w:szCs w:val="21"/>
           <w:shd w:val="clear" w:color="auto" w:fill="FFFFFF"/>
         </w:rPr>
-      </w:pPr>
-      <w:r>
-        <w:rPr>
-          <w:rFonts w:ascii="宋体" w:eastAsia="宋体" w:hAnsi="宋体" w:cs="Arial" w:hint="eastAsia"/>
-          <w:color w:val="000000"/>
-          <w:szCs w:val="21"/>
-          <w:shd w:val="clear" w:color="auto" w:fill="FFFFFF"/>
-        </w:rPr>
-        <w:t>再c</w:t>
-      </w:r>
-      <w:r>
-        <w:rPr>
-          <w:rFonts w:ascii="宋体" w:eastAsia="宋体" w:hAnsi="宋体" w:cs="Arial"/>
-          <w:color w:val="000000"/>
-          <w:szCs w:val="21"/>
-          <w:shd w:val="clear" w:color="auto" w:fill="FFFFFF"/>
-        </w:rPr>
-        <w:t>all</w:t>
-      </w:r>
-      <w:r>
-        <w:rPr>
-          <w:rFonts w:ascii="宋体" w:eastAsia="宋体" w:hAnsi="宋体" w:cs="Arial" w:hint="eastAsia"/>
-          <w:color w:val="000000"/>
-          <w:szCs w:val="21"/>
-          <w:shd w:val="clear" w:color="auto" w:fill="FFFFFF"/>
-        </w:rPr>
-        <w:t>早期选择（自动添加野鸭的位点）</w:t>
-      </w:r>
-    </w:p>
-    <w:p>
-      <w:pPr>
-        <w:rPr>
-          <w:rFonts w:ascii="宋体" w:eastAsia="宋体" w:hAnsi="宋体" w:cs="Arial"/>
-          <w:color w:val="000000"/>
-          <w:szCs w:val="21"/>
-          <w:shd w:val="clear" w:color="auto" w:fill="FFFFFF"/>
-        </w:rPr>
-      </w:pPr>
-      <w:r>
-        <w:rPr>
-          <w:rFonts w:ascii="宋体" w:eastAsia="宋体" w:hAnsi="宋体" w:cs="Arial" w:hint="eastAsia"/>
-          <w:color w:val="000000"/>
-          <w:szCs w:val="21"/>
-          <w:shd w:val="clear" w:color="auto" w:fill="FFFFFF"/>
-        </w:rPr>
-        <w:t>找一下别的</w:t>
-      </w:r>
-      <w:proofErr w:type="spellStart"/>
-      <w:r>
-        <w:rPr>
-          <w:rFonts w:ascii="宋体" w:eastAsia="宋体" w:hAnsi="宋体" w:cs="Arial" w:hint="eastAsia"/>
-          <w:color w:val="000000"/>
-          <w:szCs w:val="21"/>
-          <w:shd w:val="clear" w:color="auto" w:fill="FFFFFF"/>
-        </w:rPr>
-        <w:t>v</w:t>
-      </w:r>
-      <w:r>
-        <w:rPr>
-          <w:rFonts w:ascii="宋体" w:eastAsia="宋体" w:hAnsi="宋体" w:cs="Arial"/>
-          <w:color w:val="000000"/>
-          <w:szCs w:val="21"/>
-          <w:shd w:val="clear" w:color="auto" w:fill="FFFFFF"/>
-        </w:rPr>
-        <w:t>cf</w:t>
-      </w:r>
-      <w:proofErr w:type="spellEnd"/>
-      <w:r>
-        <w:rPr>
-          <w:rFonts w:ascii="宋体" w:eastAsia="宋体" w:hAnsi="宋体" w:cs="Arial" w:hint="eastAsia"/>
-          <w:color w:val="000000"/>
-          <w:szCs w:val="21"/>
-          <w:shd w:val="clear" w:color="auto" w:fill="FFFFFF"/>
-        </w:rPr>
-        <w:t>总数据选最合适的初始化这个表，看一下表的结构。</w:t>
-      </w:r>
-    </w:p>
-    <w:p>
-      <w:pPr>
-        <w:rPr>
-          <w:rFonts w:ascii="宋体" w:eastAsia="宋体" w:hAnsi="宋体" w:cs="Arial"/>
-          <w:color w:val="000000"/>
-          <w:szCs w:val="21"/>
-          <w:shd w:val="clear" w:color="auto" w:fill="FFFFFF"/>
-        </w:rPr>
-      </w:pPr>
-      <w:r>
-        <w:rPr>
-          <w:rFonts w:ascii="宋体" w:eastAsia="宋体" w:hAnsi="宋体" w:cs="Arial" w:hint="eastAsia"/>
-          <w:color w:val="000000"/>
-          <w:szCs w:val="21"/>
-          <w:shd w:val="clear" w:color="auto" w:fill="FFFFFF"/>
-        </w:rPr>
-        <w:t>（他妈的</w:t>
-      </w:r>
-      <w:proofErr w:type="spellStart"/>
-      <w:r>
-        <w:rPr>
-          <w:rFonts w:ascii="宋体" w:eastAsia="宋体" w:hAnsi="宋体" w:cs="Arial" w:hint="eastAsia"/>
-          <w:color w:val="000000"/>
-          <w:szCs w:val="21"/>
-          <w:shd w:val="clear" w:color="auto" w:fill="FFFFFF"/>
-        </w:rPr>
-        <w:t>f</w:t>
-      </w:r>
-      <w:r>
-        <w:rPr>
-          <w:rFonts w:ascii="宋体" w:eastAsia="宋体" w:hAnsi="宋体" w:cs="Arial"/>
-          <w:color w:val="000000"/>
-          <w:szCs w:val="21"/>
-          <w:shd w:val="clear" w:color="auto" w:fill="FFFFFF"/>
-        </w:rPr>
-        <w:t>y</w:t>
-      </w:r>
-      <w:proofErr w:type="spellEnd"/>
-      <w:r>
-        <w:rPr>
-          <w:rFonts w:ascii="宋体" w:eastAsia="宋体" w:hAnsi="宋体" w:cs="Arial" w:hint="eastAsia"/>
-          <w:color w:val="000000"/>
-          <w:szCs w:val="21"/>
-          <w:shd w:val="clear" w:color="auto" w:fill="FFFFFF"/>
-        </w:rPr>
-        <w:t>服务器那边突然无法通过h</w:t>
-      </w:r>
-      <w:r>
-        <w:rPr>
-          <w:rFonts w:ascii="宋体" w:eastAsia="宋体" w:hAnsi="宋体" w:cs="Arial"/>
-          <w:color w:val="000000"/>
-          <w:szCs w:val="21"/>
-          <w:shd w:val="clear" w:color="auto" w:fill="FFFFFF"/>
-        </w:rPr>
-        <w:t>ttp</w:t>
-      </w:r>
-      <w:r>
-        <w:rPr>
-          <w:rFonts w:ascii="宋体" w:eastAsia="宋体" w:hAnsi="宋体" w:cs="Arial" w:hint="eastAsia"/>
-          <w:color w:val="000000"/>
-          <w:szCs w:val="21"/>
-          <w:shd w:val="clear" w:color="auto" w:fill="FFFFFF"/>
-        </w:rPr>
-        <w:t>访问</w:t>
-      </w:r>
-      <w:proofErr w:type="spellStart"/>
-      <w:r>
-        <w:rPr>
-          <w:rFonts w:ascii="宋体" w:eastAsia="宋体" w:hAnsi="宋体" w:cs="Arial" w:hint="eastAsia"/>
-          <w:color w:val="000000"/>
-          <w:szCs w:val="21"/>
-          <w:shd w:val="clear" w:color="auto" w:fill="FFFFFF"/>
-        </w:rPr>
-        <w:t>my</w:t>
-      </w:r>
-      <w:r>
-        <w:rPr>
-          <w:rFonts w:ascii="宋体" w:eastAsia="宋体" w:hAnsi="宋体" w:cs="Arial"/>
-          <w:color w:val="000000"/>
-          <w:szCs w:val="21"/>
-          <w:shd w:val="clear" w:color="auto" w:fill="FFFFFF"/>
-        </w:rPr>
-        <w:t>sql</w:t>
-      </w:r>
-      <w:proofErr w:type="spellEnd"/>
-      <w:r>
-        <w:rPr>
-          <w:rFonts w:ascii="宋体" w:eastAsia="宋体" w:hAnsi="宋体" w:cs="Arial"/>
-          <w:color w:val="000000"/>
-          <w:szCs w:val="21"/>
-          <w:shd w:val="clear" w:color="auto" w:fill="FFFFFF"/>
-        </w:rPr>
-        <w:t>(</w:t>
-      </w:r>
-      <w:proofErr w:type="spellStart"/>
-      <w:r>
-        <w:rPr>
-          <w:rFonts w:ascii="宋体" w:eastAsia="宋体" w:hAnsi="宋体" w:cs="Arial"/>
-          <w:color w:val="000000"/>
-          <w:szCs w:val="21"/>
-          <w:shd w:val="clear" w:color="auto" w:fill="FFFFFF"/>
-        </w:rPr>
-        <w:t>sqlyog</w:t>
-      </w:r>
-      <w:proofErr w:type="spellEnd"/>
-      <w:r>
-        <w:rPr>
-          <w:rFonts w:ascii="宋体" w:eastAsia="宋体" w:hAnsi="宋体" w:cs="Arial" w:hint="eastAsia"/>
-          <w:color w:val="000000"/>
-          <w:szCs w:val="21"/>
-          <w:shd w:val="clear" w:color="auto" w:fill="FFFFFF"/>
-        </w:rPr>
-        <w:t>改用了</w:t>
-      </w:r>
-      <w:proofErr w:type="spellStart"/>
-      <w:r>
-        <w:rPr>
-          <w:rFonts w:ascii="宋体" w:eastAsia="宋体" w:hAnsi="宋体" w:cs="Arial" w:hint="eastAsia"/>
-          <w:color w:val="000000"/>
-          <w:szCs w:val="21"/>
-          <w:shd w:val="clear" w:color="auto" w:fill="FFFFFF"/>
-        </w:rPr>
-        <w:t>s</w:t>
-      </w:r>
-      <w:r>
-        <w:rPr>
-          <w:rFonts w:ascii="宋体" w:eastAsia="宋体" w:hAnsi="宋体" w:cs="Arial"/>
-          <w:color w:val="000000"/>
-          <w:szCs w:val="21"/>
-          <w:shd w:val="clear" w:color="auto" w:fill="FFFFFF"/>
-        </w:rPr>
         <w:t>sh</w:t>
       </w:r>
-      <w:proofErr w:type="spellEnd"/>
       <w:r>
         <w:rPr>
           <w:rFonts w:ascii="宋体" w:eastAsia="宋体" w:hAnsi="宋体" w:cs="Arial" w:hint="eastAsia"/>
@@ -865,19 +559,8 @@
           <w:sz w:val="24"/>
           <w:szCs w:val="24"/>
         </w:rPr>
-        <w:t xml:space="preserve">We selected SNPs that derived allele existing (including fixed) in mallard or </w:t>
-      </w:r>
-      <w:proofErr w:type="spellStart"/>
-      <w:r>
-        <w:rPr>
-          <w:rFonts w:ascii="Times New Roman" w:eastAsia="Times New Roman" w:hAnsi="Times New Roman" w:cs="Times New Roman"/>
-          <w:color w:val="000000"/>
-          <w:sz w:val="24"/>
-          <w:szCs w:val="24"/>
-        </w:rPr>
-        <w:t>spotbilled</w:t>
-      </w:r>
-      <w:proofErr w:type="spellEnd"/>
+        <w:t>We selected SNPs that derived allele existing (including fixed) in mallard or spotbilled</w:t>
+      </w:r>
     </w:p>
     <w:p>
       <w:pPr>
@@ -888,7 +571,6 @@
           <w:shd w:val="clear" w:color="auto" w:fill="FFFFFF"/>
         </w:rPr>
       </w:pPr>
-      <w:proofErr w:type="gramStart"/>
       <w:r>
         <w:rPr>
           <w:rFonts w:ascii="宋体" w:eastAsia="宋体" w:hAnsi="宋体" w:cs="Arial" w:hint="eastAsia"/>
@@ -905,17 +587,7 @@
           <w:szCs w:val="21"/>
           <w:shd w:val="clear" w:color="auto" w:fill="FFFFFF"/>
         </w:rPr>
-        <w:t>伍总的</w:t>
-      </w:r>
-      <w:proofErr w:type="gramEnd"/>
-      <w:r>
-        <w:rPr>
-          <w:rFonts w:ascii="宋体" w:eastAsia="宋体" w:hAnsi="宋体" w:cs="Arial"/>
-          <w:color w:val="000000"/>
-          <w:szCs w:val="21"/>
-          <w:shd w:val="clear" w:color="auto" w:fill="FFFFFF"/>
-        </w:rPr>
-        <w:t>建议：</w:t>
+        <w:t>伍总的建议：</w:t>
       </w:r>
     </w:p>
     <w:p>
@@ -1044,27 +716,7 @@
           <w:sz w:val="14"/>
           <w:szCs w:val="14"/>
         </w:rPr>
-        <w:t xml:space="preserve">Campagna, L., McCracken, K. G. &amp; </w:t>
-      </w:r>
-      <w:proofErr w:type="spellStart"/>
-      <w:r>
-        <w:rPr>
-          <w:rFonts w:ascii="NewsGothicMTOT-Regular" w:eastAsia="NewsGothicMTOT-Regular" w:cs="NewsGothicMTOT-Regular"/>
-          <w:kern w:val="0"/>
-          <w:sz w:val="14"/>
-          <w:szCs w:val="14"/>
-        </w:rPr>
-        <w:t>Lovette</w:t>
-      </w:r>
-      <w:proofErr w:type="spellEnd"/>
-      <w:r>
-        <w:rPr>
-          <w:rFonts w:ascii="NewsGothicMTOT-Regular" w:eastAsia="NewsGothicMTOT-Regular" w:cs="NewsGothicMTOT-Regular"/>
-          <w:kern w:val="0"/>
-          <w:sz w:val="14"/>
-          <w:szCs w:val="14"/>
-        </w:rPr>
-        <w:t>, I. J.</w:t>
+        <w:t>Campagna, L., McCracken, K. G. &amp; Lovette, I. J.</w:t>
       </w:r>
     </w:p>
     <w:p>
@@ -1612,27 +1264,7 @@
           <w:sz w:val="14"/>
           <w:szCs w:val="14"/>
         </w:rPr>
-        <w:t xml:space="preserve">6. </w:t>
-      </w:r>
-      <w:proofErr w:type="spellStart"/>
-      <w:r>
-        <w:rPr>
-          <w:rFonts w:ascii="NewsGothicMTOT-Regular" w:eastAsia="NewsGothicMTOT-Regular" w:cs="NewsGothicMTOT-Regular"/>
-          <w:kern w:val="0"/>
-          <w:sz w:val="14"/>
-          <w:szCs w:val="14"/>
-        </w:rPr>
-        <w:t>Burga</w:t>
-      </w:r>
-      <w:proofErr w:type="spellEnd"/>
-      <w:r>
-        <w:rPr>
-          <w:rFonts w:ascii="NewsGothicMTOT-Regular" w:eastAsia="NewsGothicMTOT-Regular" w:cs="NewsGothicMTOT-Regular"/>
-          <w:kern w:val="0"/>
-          <w:sz w:val="14"/>
-          <w:szCs w:val="14"/>
-        </w:rPr>
-        <w:t xml:space="preserve">, A. </w:t>
+        <w:t xml:space="preserve">6. Burga, A. </w:t>
       </w:r>
       <w:r>
         <w:rPr>
@@ -1682,27 +1314,7 @@
           <w:sz w:val="14"/>
           <w:szCs w:val="14"/>
         </w:rPr>
-        <w:t xml:space="preserve">7. </w:t>
-      </w:r>
-      <w:proofErr w:type="spellStart"/>
-      <w:r>
-        <w:rPr>
-          <w:rFonts w:ascii="NewsGothicMTOT-Regular" w:eastAsia="NewsGothicMTOT-Regular" w:cs="NewsGothicMTOT-Regular"/>
-          <w:kern w:val="0"/>
-          <w:sz w:val="14"/>
-          <w:szCs w:val="14"/>
-        </w:rPr>
-        <w:t>Sackton</w:t>
-      </w:r>
-      <w:proofErr w:type="spellEnd"/>
-      <w:r>
-        <w:rPr>
-          <w:rFonts w:ascii="NewsGothicMTOT-Regular" w:eastAsia="NewsGothicMTOT-Regular" w:cs="NewsGothicMTOT-Regular"/>
-          <w:kern w:val="0"/>
-          <w:sz w:val="14"/>
-          <w:szCs w:val="14"/>
-        </w:rPr>
-        <w:t xml:space="preserve">, T. B. </w:t>
+        <w:t xml:space="preserve">7. Sackton, T. B. </w:t>
       </w:r>
       <w:r>
         <w:rPr>
@@ -1792,9 +1404,8 @@
           <w:sz w:val="24"/>
           <w:szCs w:val="24"/>
         </w:rPr>
-        <w:t xml:space="preserve">Flight </w:t>
-      </w:r>
-      <w:proofErr w:type="gramStart"/>
+        <w:t>Flight loss ? why not flight not acquire</w:t>
+      </w:r>
       <w:r>
         <w:rPr>
           <w:rFonts w:ascii="宋体" w:eastAsia="宋体" w:hAnsi="宋体" w:cs="NewsGothicMTOT-Regular"/>
@@ -1803,9 +1414,18 @@
           <w:sz w:val="24"/>
           <w:szCs w:val="24"/>
         </w:rPr>
-        <w:t>loss ?</w:t>
-      </w:r>
-      <w:proofErr w:type="gramEnd"/>
+        <w:t xml:space="preserve"> </w:t>
+      </w:r>
+      <w:r>
+        <w:rPr>
+          <w:rFonts w:ascii="宋体" w:eastAsia="宋体" w:hAnsi="宋体" w:cs="NewsGothicMTOT-Regular" w:hint="eastAsia"/>
+          <w:color w:val="FF0000"/>
+          <w:kern w:val="0"/>
+          <w:sz w:val="24"/>
+          <w:szCs w:val="24"/>
+        </w:rPr>
+        <w:t>比较的</w:t>
+      </w:r>
       <w:r>
         <w:rPr>
           <w:rFonts w:ascii="宋体" w:eastAsia="宋体" w:hAnsi="宋体" w:cs="NewsGothicMTOT-Regular"/>
@@ -1814,7 +1434,17 @@
           <w:sz w:val="24"/>
           <w:szCs w:val="24"/>
         </w:rPr>
-        <w:t xml:space="preserve"> why not flight not acquire</w:t>
+        <w:t>都是飞行能力进化不成功的一些不同分支之间，是歧途不见全貌，</w:t>
+      </w:r>
+      <w:r>
+        <w:rPr>
+          <w:rFonts w:ascii="宋体" w:eastAsia="宋体" w:hAnsi="宋体" w:cs="NewsGothicMTOT-Regular" w:hint="eastAsia"/>
+          <w:color w:val="FF0000"/>
+          <w:kern w:val="0"/>
+          <w:sz w:val="24"/>
+          <w:szCs w:val="24"/>
+        </w:rPr>
+        <w:t>所以</w:t>
       </w:r>
       <w:r>
         <w:rPr>
@@ -1824,7 +1454,7 @@
           <w:sz w:val="24"/>
           <w:szCs w:val="24"/>
         </w:rPr>
-        <w:t xml:space="preserve"> </w:t>
+        <w:t>你的比较会看到这样或那样的差异而这些差异都是不同因素造成的并不能</w:t>
       </w:r>
       <w:r>
         <w:rPr>
@@ -1834,7 +1464,7 @@
           <w:sz w:val="24"/>
           <w:szCs w:val="24"/>
         </w:rPr>
-        <w:t>比较的</w:t>
+        <w:t>揭示</w:t>
       </w:r>
       <w:r>
         <w:rPr>
@@ -1844,7 +1474,17 @@
           <w:sz w:val="24"/>
           <w:szCs w:val="24"/>
         </w:rPr>
-        <w:t>都是飞行能力进化不成功的一些不同分支之间，是歧途不见全貌，</w:t>
+        <w:t>飞行能力丧失或获得的本质因素，</w:t>
+      </w:r>
+      <w:r>
+        <w:rPr>
+          <w:rFonts w:ascii="宋体" w:eastAsia="宋体" w:hAnsi="宋体" w:cs="NewsGothicMTOT-Regular"/>
+          <w:color w:val="FF0000"/>
+          <w:kern w:val="0"/>
+          <w:sz w:val="24"/>
+          <w:szCs w:val="24"/>
+        </w:rPr>
+        <w:t>而鸭子之间比较</w:t>
       </w:r>
       <w:r>
         <w:rPr>
@@ -1854,7 +1494,7 @@
           <w:sz w:val="24"/>
           <w:szCs w:val="24"/>
         </w:rPr>
-        <w:t>所以</w:t>
+        <w:t>是</w:t>
       </w:r>
       <w:r>
         <w:rPr>
@@ -1864,8 +1504,19 @@
           <w:sz w:val="24"/>
           <w:szCs w:val="24"/>
         </w:rPr>
-        <w:t>你的比较会看到这样或那样的差异而这些差异都是不同因素造成的并不能</w:t>
-      </w:r>
+        <w:t>大尺度的看到飞行能力获得的过程。</w:t>
+      </w:r>
+    </w:p>
+    <w:p>
+      <w:pPr>
+        <w:rPr>
+          <w:rFonts w:ascii="宋体" w:eastAsia="宋体" w:hAnsi="宋体" w:cs="NewsGothicMTOT-Regular"/>
+          <w:color w:val="FF0000"/>
+          <w:kern w:val="0"/>
+          <w:sz w:val="24"/>
+          <w:szCs w:val="24"/>
+        </w:rPr>
+      </w:pPr>
       <w:r>
         <w:rPr>
           <w:rFonts w:ascii="宋体" w:eastAsia="宋体" w:hAnsi="宋体" w:cs="NewsGothicMTOT-Regular" w:hint="eastAsia"/>
@@ -1874,7 +1525,7 @@
           <w:sz w:val="24"/>
           <w:szCs w:val="24"/>
         </w:rPr>
-        <w:t>揭示</w:t>
+        <w:t>但是</w:t>
       </w:r>
       <w:r>
         <w:rPr>
@@ -1884,9 +1535,11 @@
           <w:sz w:val="24"/>
           <w:szCs w:val="24"/>
         </w:rPr>
-        <w:t>飞行能力丧失或获得的本质因素，</w:t>
-      </w:r>
-      <w:r>
+        <w:t>有个问题要弄清楚，他们是基于什么证据说多次丧失飞行能力的。</w:t>
+      </w:r>
+    </w:p>
+    <w:p>
+      <w:pPr>
         <w:rPr>
           <w:rFonts w:ascii="宋体" w:eastAsia="宋体" w:hAnsi="宋体" w:cs="NewsGothicMTOT-Regular"/>
           <w:color w:val="FF0000"/>
@@ -1894,18 +1547,7 @@
           <w:sz w:val="24"/>
           <w:szCs w:val="24"/>
         </w:rPr>
-        <w:t>而鸭子之间比较</w:t>
-      </w:r>
-      <w:r>
-        <w:rPr>
-          <w:rFonts w:ascii="宋体" w:eastAsia="宋体" w:hAnsi="宋体" w:cs="NewsGothicMTOT-Regular" w:hint="eastAsia"/>
-          <w:color w:val="FF0000"/>
-          <w:kern w:val="0"/>
-          <w:sz w:val="24"/>
-          <w:szCs w:val="24"/>
-        </w:rPr>
-        <w:t>是</w:t>
-      </w:r>
+      </w:pPr>
       <w:r>
         <w:rPr>
           <w:rFonts w:ascii="宋体" w:eastAsia="宋体" w:hAnsi="宋体" w:cs="NewsGothicMTOT-Regular"/>
@@ -1914,103 +1556,7 @@
           <w:sz w:val="24"/>
           <w:szCs w:val="24"/>
         </w:rPr>
-        <w:t>大尺度的看到飞行能力获得的过程。</w:t>
-      </w:r>
-    </w:p>
-    <w:p>
-      <w:pPr>
-        <w:rPr>
-          <w:rFonts w:ascii="宋体" w:eastAsia="宋体" w:hAnsi="宋体" w:cs="NewsGothicMTOT-Regular"/>
-          <w:color w:val="FF0000"/>
-          <w:kern w:val="0"/>
-          <w:sz w:val="24"/>
-          <w:szCs w:val="24"/>
-        </w:rPr>
-      </w:pPr>
-      <w:r>
-        <w:rPr>
-          <w:rFonts w:ascii="宋体" w:eastAsia="宋体" w:hAnsi="宋体" w:cs="NewsGothicMTOT-Regular" w:hint="eastAsia"/>
-          <w:color w:val="FF0000"/>
-          <w:kern w:val="0"/>
-          <w:sz w:val="24"/>
-          <w:szCs w:val="24"/>
-        </w:rPr>
-        <w:t>但是</w:t>
-      </w:r>
-      <w:r>
-        <w:rPr>
-          <w:rFonts w:ascii="宋体" w:eastAsia="宋体" w:hAnsi="宋体" w:cs="NewsGothicMTOT-Regular"/>
-          <w:color w:val="FF0000"/>
-          <w:kern w:val="0"/>
-          <w:sz w:val="24"/>
-          <w:szCs w:val="24"/>
-        </w:rPr>
-        <w:t>有个问题要弄清楚，他们是基于什么证据</w:t>
-      </w:r>
-      <w:proofErr w:type="gramStart"/>
-      <w:r>
-        <w:rPr>
-          <w:rFonts w:ascii="宋体" w:eastAsia="宋体" w:hAnsi="宋体" w:cs="NewsGothicMTOT-Regular"/>
-          <w:color w:val="FF0000"/>
-          <w:kern w:val="0"/>
-          <w:sz w:val="24"/>
-          <w:szCs w:val="24"/>
-        </w:rPr>
-        <w:t>说多次</w:t>
-      </w:r>
-      <w:proofErr w:type="gramEnd"/>
-      <w:r>
-        <w:rPr>
-          <w:rFonts w:ascii="宋体" w:eastAsia="宋体" w:hAnsi="宋体" w:cs="NewsGothicMTOT-Regular"/>
-          <w:color w:val="FF0000"/>
-          <w:kern w:val="0"/>
-          <w:sz w:val="24"/>
-          <w:szCs w:val="24"/>
-        </w:rPr>
-        <w:t>丧失飞行能力的。</w:t>
-      </w:r>
-    </w:p>
-    <w:p>
-      <w:pPr>
-        <w:rPr>
-          <w:rFonts w:ascii="宋体" w:eastAsia="宋体" w:hAnsi="宋体" w:cs="NewsGothicMTOT-Regular"/>
-          <w:color w:val="FF0000"/>
-          <w:kern w:val="0"/>
-          <w:sz w:val="24"/>
-          <w:szCs w:val="24"/>
-        </w:rPr>
-      </w:pPr>
-      <w:r>
-        <w:rPr>
-          <w:rFonts w:ascii="宋体" w:eastAsia="宋体" w:hAnsi="宋体" w:cs="NewsGothicMTOT-Regular"/>
-          <w:color w:val="FF0000"/>
-          <w:kern w:val="0"/>
-          <w:sz w:val="24"/>
-          <w:szCs w:val="24"/>
-        </w:rPr>
-        <w:t xml:space="preserve">Before we discuss about flight loss, we’d better have more comprehensive on how flight </w:t>
-      </w:r>
-      <w:proofErr w:type="gramStart"/>
-      <w:r>
-        <w:rPr>
-          <w:rFonts w:ascii="宋体" w:eastAsia="宋体" w:hAnsi="宋体" w:cs="NewsGothicMTOT-Regular"/>
-          <w:color w:val="FF0000"/>
-          <w:kern w:val="0"/>
-          <w:sz w:val="24"/>
-          <w:szCs w:val="24"/>
-        </w:rPr>
-        <w:t>are</w:t>
-      </w:r>
-      <w:proofErr w:type="gramEnd"/>
-      <w:r>
-        <w:rPr>
-          <w:rFonts w:ascii="宋体" w:eastAsia="宋体" w:hAnsi="宋体" w:cs="NewsGothicMTOT-Regular"/>
-          <w:color w:val="FF0000"/>
-          <w:kern w:val="0"/>
-          <w:sz w:val="24"/>
-          <w:szCs w:val="24"/>
-        </w:rPr>
-        <w:t xml:space="preserve"> acquire and evolved.</w:t>
+        <w:t>Before we discuss about flight loss, we’d better have more comprehensive on how flight are acquire and evolved.</w:t>
       </w:r>
     </w:p>
     <w:p>
@@ -2070,178 +1616,7 @@
           <w:sz w:val="24"/>
           <w:szCs w:val="24"/>
         </w:rPr>
-        <w:t xml:space="preserve"> has been found </w:t>
-      </w:r>
-      <w:proofErr w:type="spellStart"/>
-      <w:r>
-        <w:rPr>
-          <w:rFonts w:ascii="Times New Roman" w:eastAsia="Times New Roman" w:hAnsi="Times New Roman" w:cs="Times New Roman"/>
-          <w:color w:val="000000"/>
-          <w:sz w:val="24"/>
-          <w:szCs w:val="24"/>
-        </w:rPr>
-        <w:t>imcompitet</w:t>
-      </w:r>
-      <w:proofErr w:type="spellEnd"/>
-      <w:r>
-        <w:rPr>
-          <w:rFonts w:ascii="Times New Roman" w:eastAsia="Times New Roman" w:hAnsi="Times New Roman" w:cs="Times New Roman"/>
-          <w:color w:val="000000"/>
-          <w:sz w:val="24"/>
-          <w:szCs w:val="24"/>
-        </w:rPr>
-        <w:t xml:space="preserve"> with recent research especially genetic </w:t>
-      </w:r>
-      <w:proofErr w:type="gramStart"/>
-      <w:r>
-        <w:rPr>
-          <w:rFonts w:ascii="Times New Roman" w:eastAsia="Times New Roman" w:hAnsi="Times New Roman" w:cs="Times New Roman"/>
-          <w:color w:val="000000"/>
-          <w:sz w:val="24"/>
-          <w:szCs w:val="24"/>
-        </w:rPr>
-        <w:t>data(</w:t>
-      </w:r>
-      <w:proofErr w:type="spellStart"/>
-      <w:proofErr w:type="gramEnd"/>
-      <w:r>
-        <w:rPr>
-          <w:rFonts w:ascii="Times New Roman" w:eastAsia="Times New Roman" w:hAnsi="Times New Roman" w:cs="Times New Roman"/>
-          <w:color w:val="000000"/>
-          <w:sz w:val="24"/>
-          <w:szCs w:val="24"/>
-        </w:rPr>
-        <w:t>greger</w:t>
-      </w:r>
-      <w:proofErr w:type="spellEnd"/>
-      <w:r>
-        <w:rPr>
-          <w:rFonts w:ascii="Times New Roman" w:eastAsia="Times New Roman" w:hAnsi="Times New Roman" w:cs="Times New Roman"/>
-          <w:color w:val="000000"/>
-          <w:sz w:val="24"/>
-          <w:szCs w:val="24"/>
-        </w:rPr>
-        <w:t xml:space="preserve"> </w:t>
-      </w:r>
-      <w:proofErr w:type="spellStart"/>
-      <w:r>
-        <w:rPr>
-          <w:rFonts w:ascii="Times New Roman" w:eastAsia="Times New Roman" w:hAnsi="Times New Roman" w:cs="Times New Roman"/>
-          <w:color w:val="000000"/>
-          <w:sz w:val="24"/>
-          <w:szCs w:val="24"/>
-        </w:rPr>
-        <w:t>loranze</w:t>
-      </w:r>
-      <w:proofErr w:type="spellEnd"/>
-      <w:r>
-        <w:rPr>
-          <w:rFonts w:ascii="Times New Roman" w:eastAsia="Times New Roman" w:hAnsi="Times New Roman" w:cs="Times New Roman"/>
-          <w:color w:val="000000"/>
-          <w:sz w:val="24"/>
-          <w:szCs w:val="24"/>
-        </w:rPr>
-        <w:t xml:space="preserve"> </w:t>
-      </w:r>
-      <w:proofErr w:type="spellStart"/>
-      <w:r>
-        <w:rPr>
-          <w:rFonts w:ascii="Times New Roman" w:eastAsia="Times New Roman" w:hAnsi="Times New Roman" w:cs="Times New Roman"/>
-          <w:color w:val="000000"/>
-          <w:sz w:val="24"/>
-          <w:szCs w:val="24"/>
-        </w:rPr>
-        <w:t>martain</w:t>
-      </w:r>
-      <w:proofErr w:type="spellEnd"/>
-      <w:r>
-        <w:rPr>
-          <w:rFonts w:ascii="Times New Roman" w:eastAsia="Times New Roman" w:hAnsi="Times New Roman" w:cs="Times New Roman"/>
-          <w:color w:val="000000"/>
-          <w:sz w:val="24"/>
-          <w:szCs w:val="24"/>
-        </w:rPr>
-        <w:t xml:space="preserve">). It’s suggested as more a nature consequence by </w:t>
-      </w:r>
-      <w:proofErr w:type="spellStart"/>
-      <w:r>
-        <w:rPr>
-          <w:rFonts w:ascii="Times New Roman" w:eastAsia="Times New Roman" w:hAnsi="Times New Roman" w:cs="Times New Roman"/>
-          <w:color w:val="000000"/>
-          <w:sz w:val="24"/>
-          <w:szCs w:val="24"/>
-        </w:rPr>
-        <w:t>greger</w:t>
-      </w:r>
-      <w:proofErr w:type="spellEnd"/>
-      <w:r>
-        <w:rPr>
-          <w:rFonts w:ascii="Times New Roman" w:eastAsia="Times New Roman" w:hAnsi="Times New Roman" w:cs="Times New Roman"/>
-          <w:color w:val="000000"/>
-          <w:sz w:val="24"/>
-          <w:szCs w:val="24"/>
-        </w:rPr>
-        <w:t xml:space="preserve"> Larson et al. our founding that the domestic lineage before </w:t>
-      </w:r>
-      <w:proofErr w:type="spellStart"/>
-      <w:r>
-        <w:rPr>
-          <w:rFonts w:ascii="Times New Roman" w:eastAsia="Times New Roman" w:hAnsi="Times New Roman" w:cs="Times New Roman"/>
-          <w:color w:val="000000"/>
-          <w:sz w:val="24"/>
-          <w:szCs w:val="24"/>
-        </w:rPr>
-        <w:t>civilation</w:t>
-      </w:r>
-      <w:proofErr w:type="spellEnd"/>
-      <w:r>
-        <w:rPr>
-          <w:rFonts w:ascii="Times New Roman" w:eastAsia="Times New Roman" w:hAnsi="Times New Roman" w:cs="Times New Roman"/>
-          <w:color w:val="000000"/>
-          <w:sz w:val="24"/>
-          <w:szCs w:val="24"/>
-        </w:rPr>
-        <w:t xml:space="preserve"> </w:t>
-      </w:r>
-      <w:proofErr w:type="spellStart"/>
-      <w:r>
-        <w:rPr>
-          <w:rFonts w:ascii="Times New Roman" w:eastAsia="Times New Roman" w:hAnsi="Times New Roman" w:cs="Times New Roman"/>
-          <w:color w:val="000000"/>
-          <w:sz w:val="24"/>
-          <w:szCs w:val="24"/>
-        </w:rPr>
-        <w:t>supporte</w:t>
-      </w:r>
-      <w:proofErr w:type="spellEnd"/>
-      <w:r>
-        <w:rPr>
-          <w:rFonts w:ascii="Times New Roman" w:eastAsia="Times New Roman" w:hAnsi="Times New Roman" w:cs="Times New Roman"/>
-          <w:color w:val="000000"/>
-          <w:sz w:val="24"/>
-          <w:szCs w:val="24"/>
-        </w:rPr>
-        <w:t xml:space="preserve"> this idea. Meanwhile recent research also </w:t>
-      </w:r>
-      <w:proofErr w:type="spellStart"/>
-      <w:r>
-        <w:rPr>
-          <w:rFonts w:ascii="Times New Roman" w:eastAsia="Times New Roman" w:hAnsi="Times New Roman" w:cs="Times New Roman"/>
-          <w:color w:val="000000"/>
-          <w:sz w:val="24"/>
-          <w:szCs w:val="24"/>
-        </w:rPr>
-        <w:t>suggenst</w:t>
-      </w:r>
-      <w:proofErr w:type="spellEnd"/>
-      <w:r>
-        <w:rPr>
-          <w:rFonts w:ascii="Times New Roman" w:eastAsia="Times New Roman" w:hAnsi="Times New Roman" w:cs="Times New Roman"/>
-          <w:color w:val="000000"/>
-          <w:sz w:val="24"/>
-          <w:szCs w:val="24"/>
-        </w:rPr>
-        <w:t xml:space="preserve"> that the critical changes at only a few domestication loci may not the true, instead many mutations of small effect, especially those frequency </w:t>
+        <w:t xml:space="preserve"> has been found imcompitet with recent research especially genetic data(greger loranze martain). It’s suggested as more a nature consequence by greger Larson et al. our founding that the domestic lineage before civilation supporte this idea. Meanwhile recent research also suggenst that the critical changes at only a few domestication loci may not the true, instead many mutations of small effect, especially those frequency </w:t>
       </w:r>
       <w:r>
         <w:rPr>
@@ -2261,78 +1636,16 @@
           <w:sz w:val="24"/>
           <w:szCs w:val="24"/>
         </w:rPr>
-        <w:t xml:space="preserve">More explicit some different kind of domestic trait may </w:t>
-      </w:r>
-      <w:proofErr w:type="spellStart"/>
+        <w:t>More explicit some different kind of domestic trait may consitiute on the context that supplied by nature.</w:t>
+      </w:r>
       <w:r>
         <w:rPr>
           <w:rFonts w:ascii="Times New Roman" w:eastAsia="Times New Roman" w:hAnsi="Times New Roman" w:cs="Times New Roman"/>
-          <w:strike/>
-          <w:color w:val="000000"/>
-          <w:sz w:val="24"/>
-          <w:szCs w:val="24"/>
-        </w:rPr>
-        <w:t>consitiute</w:t>
-      </w:r>
-      <w:proofErr w:type="spellEnd"/>
-      <w:r>
-        <w:rPr>
-          <w:rFonts w:ascii="Times New Roman" w:eastAsia="Times New Roman" w:hAnsi="Times New Roman" w:cs="Times New Roman"/>
-          <w:strike/>
-          <w:color w:val="000000"/>
-          <w:sz w:val="24"/>
-          <w:szCs w:val="24"/>
-        </w:rPr>
-        <w:t xml:space="preserve"> on the context that supplied by nature.</w:t>
-      </w:r>
-      <w:r>
-        <w:rPr>
-          <w:rFonts w:ascii="Times New Roman" w:eastAsia="Times New Roman" w:hAnsi="Times New Roman" w:cs="Times New Roman"/>
-          <w:color w:val="000000"/>
-          <w:sz w:val="24"/>
-          <w:szCs w:val="24"/>
-        </w:rPr>
-        <w:t xml:space="preserve"> In </w:t>
-      </w:r>
-      <w:proofErr w:type="gramStart"/>
-      <w:r>
-        <w:rPr>
-          <w:rFonts w:ascii="Times New Roman" w:eastAsia="Times New Roman" w:hAnsi="Times New Roman" w:cs="Times New Roman"/>
-          <w:color w:val="000000"/>
-          <w:sz w:val="24"/>
-          <w:szCs w:val="24"/>
-        </w:rPr>
-        <w:t>addition</w:t>
-      </w:r>
-      <w:proofErr w:type="gramEnd"/>
-      <w:r>
-        <w:rPr>
-          <w:rFonts w:ascii="Times New Roman" w:eastAsia="Times New Roman" w:hAnsi="Times New Roman" w:cs="Times New Roman"/>
-          <w:color w:val="000000"/>
-          <w:sz w:val="24"/>
-          <w:szCs w:val="24"/>
-        </w:rPr>
-        <w:t xml:space="preserve"> researches on flightless also reveal different mechanisms underlying different case. The evolution context may should be highlight for those functional studies. Our research may provide a case to further illustrate both the domestication and flightless process were long-term evolution, longer than our expectation. surprised found the longer evolutionary history than expected further supported the important of evolutionary context.  both domestication and evolution of </w:t>
-      </w:r>
-      <w:proofErr w:type="gramStart"/>
-      <w:r>
-        <w:rPr>
-          <w:rFonts w:ascii="Times New Roman" w:eastAsia="Times New Roman" w:hAnsi="Times New Roman" w:cs="Times New Roman"/>
-          <w:color w:val="000000"/>
-          <w:sz w:val="24"/>
-          <w:szCs w:val="24"/>
-        </w:rPr>
-        <w:t>flight  It</w:t>
-      </w:r>
-      <w:proofErr w:type="gramEnd"/>
-      <w:r>
-        <w:rPr>
-          <w:rFonts w:ascii="Times New Roman" w:eastAsia="Times New Roman" w:hAnsi="Times New Roman" w:cs="Times New Roman"/>
-          <w:color w:val="000000"/>
-          <w:sz w:val="24"/>
-          <w:szCs w:val="24"/>
-        </w:rPr>
-        <w:t xml:space="preserve"> seems all those process which domestication and flight/flightless evolution were long-term evolutionary for  </w:t>
+          <w:color w:val="000000"/>
+          <w:sz w:val="24"/>
+          <w:szCs w:val="24"/>
+        </w:rPr>
+        <w:t xml:space="preserve"> In addition researches on flightless also reveal different mechanisms underlying different case. The evolution context may should be highlight for those functional studies. Our research may provide a case to further illustrate both the domestication and flightless process were long-term evolution, longer than our expectation. surprised found the longer evolutionary history than expected further supported the important of evolutionary context.  both domestication and evolution of flight  It seems all those process which domestication and flight/flightless evolution were long-term evolutionary for  </w:t>
       </w:r>
     </w:p>
     <w:p>
@@ -2467,25 +1780,14 @@
         </w:rPr>
         <w:t xml:space="preserve"> ; </w:t>
       </w:r>
-      <w:proofErr w:type="gramStart"/>
-      <w:r>
-        <w:rPr>
-          <w:rFonts w:ascii="Arial" w:hAnsi="Arial" w:cs="Arial"/>
-          <w:color w:val="313083"/>
-          <w:sz w:val="20"/>
-          <w:szCs w:val="20"/>
-        </w:rPr>
-        <w:t>梅应琪</w:t>
-      </w:r>
-      <w:proofErr w:type="gramEnd"/>
-      <w:r>
-        <w:rPr>
-          <w:rFonts w:ascii="Arial" w:hAnsi="Arial" w:cs="Arial"/>
-          <w:color w:val="313083"/>
-          <w:sz w:val="20"/>
-          <w:szCs w:val="20"/>
-        </w:rPr>
-        <w:t>译</w:t>
+      <w:r>
+        <w:rPr>
+          <w:rFonts w:ascii="Arial" w:hAnsi="Arial" w:cs="Arial"/>
+          <w:color w:val="313083"/>
+          <w:sz w:val="20"/>
+          <w:szCs w:val="20"/>
+        </w:rPr>
+        <w:t>梅应琪译</w:t>
       </w:r>
       <w:r>
         <w:rPr>
@@ -2521,27 +1823,7 @@
           <w:sz w:val="20"/>
           <w:szCs w:val="20"/>
         </w:rPr>
-        <w:t>台湾东</w:t>
-      </w:r>
-      <w:proofErr w:type="gramStart"/>
-      <w:r>
-        <w:rPr>
-          <w:rFonts w:ascii="Arial" w:hAnsi="Arial" w:cs="Arial"/>
-          <w:color w:val="313083"/>
-          <w:sz w:val="20"/>
-          <w:szCs w:val="20"/>
-        </w:rPr>
-        <w:t>贩股份</w:t>
-      </w:r>
-      <w:proofErr w:type="gramEnd"/>
-      <w:r>
-        <w:rPr>
-          <w:rFonts w:ascii="Arial" w:hAnsi="Arial" w:cs="Arial"/>
-          <w:color w:val="313083"/>
-          <w:sz w:val="20"/>
-          <w:szCs w:val="20"/>
-        </w:rPr>
-        <w:t>有限</w:t>
+        <w:t>台湾东贩股份有限</w:t>
       </w:r>
     </w:p>
     <w:p>
@@ -2722,27 +2004,7 @@
           <w:color w:val="313083"/>
           <w:szCs w:val="21"/>
         </w:rPr>
-        <w:t xml:space="preserve">Flight </w:t>
-      </w:r>
-      <w:proofErr w:type="gramStart"/>
-      <w:r>
-        <w:rPr>
-          <w:rFonts w:ascii="Arial" w:hAnsi="Arial" w:cs="Arial"/>
-          <w:strike/>
-          <w:color w:val="313083"/>
-          <w:szCs w:val="21"/>
-        </w:rPr>
-        <w:t>ways :</w:t>
-      </w:r>
-      <w:proofErr w:type="gramEnd"/>
-      <w:r>
-        <w:rPr>
-          <w:rFonts w:ascii="Arial" w:hAnsi="Arial" w:cs="Arial"/>
-          <w:strike/>
-          <w:color w:val="313083"/>
-          <w:szCs w:val="21"/>
-        </w:rPr>
-        <w:t xml:space="preserve"> life and loss at the edge of extinction  </w:t>
+        <w:t xml:space="preserve">Flight ways : life and loss at the edge of extinction  </w:t>
       </w:r>
     </w:p>
     <w:p>
@@ -2806,7 +2068,6 @@
           <w:szCs w:val="20"/>
         </w:rPr>
       </w:pPr>
-      <w:bookmarkStart w:id="0" w:name="_GoBack"/>
       <w:r>
         <w:rPr>
           <w:rFonts w:ascii="Arial" w:hAnsi="Arial" w:cs="Arial"/>
@@ -2815,40 +2076,7 @@
           <w:sz w:val="20"/>
           <w:szCs w:val="20"/>
         </w:rPr>
-        <w:t xml:space="preserve">The inner </w:t>
-      </w:r>
-      <w:proofErr w:type="gramStart"/>
-      <w:r>
-        <w:rPr>
-          <w:rFonts w:ascii="Arial" w:hAnsi="Arial" w:cs="Arial"/>
-          <w:strike/>
-          <w:color w:val="313083"/>
-          <w:sz w:val="20"/>
-          <w:szCs w:val="20"/>
-        </w:rPr>
-        <w:t>bird :</w:t>
-      </w:r>
-      <w:proofErr w:type="gramEnd"/>
-      <w:r>
-        <w:rPr>
-          <w:rFonts w:ascii="Arial" w:hAnsi="Arial" w:cs="Arial"/>
-          <w:strike/>
-          <w:color w:val="313083"/>
-          <w:sz w:val="20"/>
-          <w:szCs w:val="20"/>
-        </w:rPr>
-        <w:t xml:space="preserve"> anatomy and evolution</w:t>
-      </w:r>
-      <w:bookmarkEnd w:id="0"/>
-      <w:r>
-        <w:rPr>
-          <w:rFonts w:ascii="Arial" w:hAnsi="Arial" w:cs="Arial"/>
-          <w:strike/>
-          <w:color w:val="313083"/>
-          <w:sz w:val="20"/>
-          <w:szCs w:val="20"/>
-        </w:rPr>
-        <w:t xml:space="preserve">  </w:t>
+        <w:t xml:space="preserve">The inner bird : anatomy and evolution  </w:t>
       </w:r>
     </w:p>
     <w:p>
@@ -3159,6 +2387,327 @@
         <w:fldChar w:fldCharType="end"/>
       </w:r>
     </w:p>
+    <w:p>
+      <w:pPr>
+        <w:widowControl/>
+        <w:jc w:val="left"/>
+        <w:rPr>
+          <w:rFonts w:ascii="宋体" w:eastAsia="宋体" w:hAnsi="宋体" w:cs="Times New Roman"/>
+          <w:strike/>
+          <w:color w:val="FF0000"/>
+          <w:sz w:val="24"/>
+          <w:szCs w:val="24"/>
+        </w:rPr>
+      </w:pPr>
+      <w:r>
+        <w:rPr>
+          <w:rFonts w:ascii="宋体" w:eastAsia="宋体" w:hAnsi="宋体" w:cs="Times New Roman"/>
+          <w:strike/>
+          <w:color w:val="FF0000"/>
+          <w:sz w:val="24"/>
+          <w:szCs w:val="24"/>
+        </w:rPr>
+        <w:br w:type="page"/>
+      </w:r>
+    </w:p>
+    <w:p>
+      <w:pPr>
+        <w:rPr>
+          <w:rFonts w:ascii="宋体" w:eastAsia="宋体" w:hAnsi="宋体" w:cs="Times New Roman"/>
+          <w:color w:val="000000" w:themeColor="text1"/>
+          <w:sz w:val="24"/>
+          <w:szCs w:val="24"/>
+        </w:rPr>
+      </w:pPr>
+      <w:r>
+        <w:rPr>
+          <w:rFonts w:ascii="宋体" w:eastAsia="宋体" w:hAnsi="宋体" w:cs="Times New Roman" w:hint="eastAsia"/>
+          <w:color w:val="000000" w:themeColor="text1"/>
+          <w:sz w:val="24"/>
+          <w:szCs w:val="24"/>
+        </w:rPr>
+        <w:lastRenderedPageBreak/>
+        <w:t>2</w:t>
+      </w:r>
+      <w:r>
+        <w:rPr>
+          <w:rFonts w:ascii="宋体" w:eastAsia="宋体" w:hAnsi="宋体" w:cs="Times New Roman"/>
+          <w:color w:val="000000" w:themeColor="text1"/>
+          <w:sz w:val="24"/>
+          <w:szCs w:val="24"/>
+        </w:rPr>
+        <w:t>021</w:t>
+      </w:r>
+      <w:r>
+        <w:rPr>
+          <w:rFonts w:ascii="宋体" w:eastAsia="宋体" w:hAnsi="宋体" w:cs="Times New Roman" w:hint="eastAsia"/>
+          <w:color w:val="000000" w:themeColor="text1"/>
+          <w:sz w:val="24"/>
+          <w:szCs w:val="24"/>
+        </w:rPr>
+        <w:t>/</w:t>
+      </w:r>
+      <w:r>
+        <w:rPr>
+          <w:rFonts w:ascii="宋体" w:eastAsia="宋体" w:hAnsi="宋体" w:cs="Times New Roman"/>
+          <w:color w:val="000000" w:themeColor="text1"/>
+          <w:sz w:val="24"/>
+          <w:szCs w:val="24"/>
+        </w:rPr>
+        <w:t>6/27</w:t>
+      </w:r>
+    </w:p>
+    <w:p>
+      <w:pPr>
+        <w:autoSpaceDE w:val="0"/>
+        <w:autoSpaceDN w:val="0"/>
+        <w:adjustRightInd w:val="0"/>
+        <w:jc w:val="left"/>
+        <w:rPr>
+          <w:rFonts w:ascii="Harding-Bold" w:hAnsi="Harding-Bold" w:cs="Harding-Bold"/>
+          <w:b/>
+          <w:bCs/>
+          <w:kern w:val="0"/>
+          <w:sz w:val="52"/>
+          <w:szCs w:val="52"/>
+        </w:rPr>
+      </w:pPr>
+      <w:r>
+        <w:rPr>
+          <w:rFonts w:ascii="宋体" w:eastAsia="宋体" w:hAnsi="宋体" w:cs="Times New Roman" w:hint="eastAsia"/>
+          <w:color w:val="000000" w:themeColor="text1"/>
+          <w:sz w:val="24"/>
+          <w:szCs w:val="24"/>
+        </w:rPr>
+        <w:t>回头关注一下，</w:t>
+      </w:r>
+      <w:r>
+        <w:rPr>
+          <w:rFonts w:ascii="Harding-Bold" w:hAnsi="Harding-Bold" w:cs="Harding-Bold"/>
+          <w:b/>
+          <w:bCs/>
+          <w:kern w:val="0"/>
+          <w:sz w:val="52"/>
+          <w:szCs w:val="52"/>
+        </w:rPr>
+        <w:t>Magnetic sensitivity of cryptochrome 4 from</w:t>
+      </w:r>
+    </w:p>
+    <w:p>
+      <w:pPr>
+        <w:rPr>
+          <w:rFonts w:ascii="Harding-Bold" w:hAnsi="Harding-Bold" w:cs="Harding-Bold"/>
+          <w:b/>
+          <w:bCs/>
+          <w:kern w:val="0"/>
+          <w:sz w:val="52"/>
+          <w:szCs w:val="52"/>
+        </w:rPr>
+      </w:pPr>
+      <w:r>
+        <w:rPr>
+          <w:rFonts w:ascii="Harding-Bold" w:hAnsi="Harding-Bold" w:cs="Harding-Bold"/>
+          <w:b/>
+          <w:bCs/>
+          <w:kern w:val="0"/>
+          <w:sz w:val="52"/>
+          <w:szCs w:val="52"/>
+        </w:rPr>
+        <w:t>a migratory songbird</w:t>
+      </w:r>
+    </w:p>
+    <w:p>
+      <w:pPr>
+        <w:rPr>
+          <w:rFonts w:ascii="宋体" w:eastAsia="宋体" w:hAnsi="宋体" w:cs="Times New Roman"/>
+          <w:color w:val="000000" w:themeColor="text1"/>
+          <w:sz w:val="24"/>
+          <w:szCs w:val="24"/>
+        </w:rPr>
+      </w:pPr>
+      <w:r>
+        <w:rPr>
+          <w:rFonts w:ascii="宋体" w:eastAsia="宋体" w:hAnsi="宋体" w:cs="Times New Roman" w:hint="eastAsia"/>
+          <w:color w:val="000000" w:themeColor="text1"/>
+          <w:sz w:val="24"/>
+          <w:szCs w:val="24"/>
+        </w:rPr>
+        <w:t>这篇</w:t>
+      </w:r>
+      <w:r>
+        <w:rPr>
+          <w:rFonts w:ascii="宋体" w:eastAsia="宋体" w:hAnsi="宋体" w:cs="Times New Roman" w:hint="eastAsia"/>
+          <w:color w:val="000000" w:themeColor="text1"/>
+          <w:sz w:val="24"/>
+          <w:szCs w:val="24"/>
+        </w:rPr>
+        <w:t>文章的基因，</w:t>
+      </w:r>
+      <w:r>
+        <w:rPr>
+          <w:rFonts w:ascii="宋体" w:eastAsia="宋体" w:hAnsi="宋体" w:cs="Times New Roman"/>
+          <w:color w:val="000000" w:themeColor="text1"/>
+          <w:sz w:val="24"/>
+          <w:szCs w:val="24"/>
+        </w:rPr>
+        <w:t>If the magnetic field effect on CRY4 forms the basis of the magnetic</w:t>
+      </w:r>
+      <w:r>
+        <w:rPr>
+          <w:rFonts w:ascii="宋体" w:eastAsia="宋体" w:hAnsi="宋体" w:cs="Times New Roman"/>
+          <w:color w:val="000000" w:themeColor="text1"/>
+          <w:sz w:val="24"/>
+          <w:szCs w:val="24"/>
+        </w:rPr>
+        <w:t xml:space="preserve"> </w:t>
+      </w:r>
+      <w:r>
+        <w:rPr>
+          <w:rFonts w:ascii="宋体" w:eastAsia="宋体" w:hAnsi="宋体" w:cs="Times New Roman"/>
+          <w:color w:val="000000" w:themeColor="text1"/>
+          <w:sz w:val="24"/>
+          <w:szCs w:val="24"/>
+        </w:rPr>
+        <w:t>compass sense in night-migratory robins, it should have been optimized</w:t>
+      </w:r>
+      <w:r>
+        <w:rPr>
+          <w:rFonts w:ascii="宋体" w:eastAsia="宋体" w:hAnsi="宋体" w:cs="Times New Roman"/>
+          <w:color w:val="000000" w:themeColor="text1"/>
+          <w:sz w:val="24"/>
+          <w:szCs w:val="24"/>
+        </w:rPr>
+        <w:t xml:space="preserve"> </w:t>
+      </w:r>
+      <w:r>
+        <w:rPr>
+          <w:rFonts w:ascii="宋体" w:eastAsia="宋体" w:hAnsi="宋体" w:cs="Times New Roman"/>
+          <w:color w:val="000000" w:themeColor="text1"/>
+          <w:sz w:val="24"/>
+          <w:szCs w:val="24"/>
+        </w:rPr>
+        <w:t>by evolution. We therefore compared the magnetic field effects on</w:t>
+      </w:r>
+      <w:r>
+        <w:rPr>
+          <w:rFonts w:ascii="宋体" w:eastAsia="宋体" w:hAnsi="宋体" w:cs="Times New Roman"/>
+          <w:color w:val="000000" w:themeColor="text1"/>
+          <w:sz w:val="24"/>
+          <w:szCs w:val="24"/>
+        </w:rPr>
+        <w:t xml:space="preserve"> </w:t>
+      </w:r>
+      <w:r>
+        <w:rPr>
+          <w:rFonts w:ascii="宋体" w:eastAsia="宋体" w:hAnsi="宋体" w:cs="Times New Roman"/>
+          <w:color w:val="000000" w:themeColor="text1"/>
+          <w:sz w:val="24"/>
+          <w:szCs w:val="24"/>
+        </w:rPr>
+        <w:t>ErCRY4 with those on CRY4 proteins from two non-migratory birds,</w:t>
+      </w:r>
+      <w:r>
+        <w:rPr>
+          <w:rFonts w:ascii="宋体" w:eastAsia="宋体" w:hAnsi="宋体" w:cs="Times New Roman"/>
+          <w:color w:val="000000" w:themeColor="text1"/>
+          <w:sz w:val="24"/>
+          <w:szCs w:val="24"/>
+        </w:rPr>
+        <w:t xml:space="preserve"> </w:t>
+      </w:r>
+      <w:r>
+        <w:rPr>
+          <w:rFonts w:ascii="宋体" w:eastAsia="宋体" w:hAnsi="宋体" w:cs="Times New Roman"/>
+          <w:color w:val="000000" w:themeColor="text1"/>
+          <w:sz w:val="24"/>
+          <w:szCs w:val="24"/>
+        </w:rPr>
+        <w:t>pigeon33 (C. livia) and chicken (G. gallus), in which we expect there to</w:t>
+      </w:r>
+      <w:r>
+        <w:rPr>
+          <w:rFonts w:ascii="宋体" w:eastAsia="宋体" w:hAnsi="宋体" w:cs="Times New Roman"/>
+          <w:color w:val="000000" w:themeColor="text1"/>
+          <w:sz w:val="24"/>
+          <w:szCs w:val="24"/>
+        </w:rPr>
+        <w:t xml:space="preserve"> </w:t>
+      </w:r>
+      <w:r>
+        <w:rPr>
+          <w:rFonts w:ascii="宋体" w:eastAsia="宋体" w:hAnsi="宋体" w:cs="Times New Roman"/>
+          <w:color w:val="000000" w:themeColor="text1"/>
+          <w:sz w:val="24"/>
+          <w:szCs w:val="24"/>
+        </w:rPr>
+        <w:t>have been less evolutionary pressure to optimize any light-dependent</w:t>
+      </w:r>
+      <w:r>
+        <w:rPr>
+          <w:rFonts w:ascii="宋体" w:eastAsia="宋体" w:hAnsi="宋体" w:cs="Times New Roman"/>
+          <w:color w:val="000000" w:themeColor="text1"/>
+          <w:sz w:val="24"/>
+          <w:szCs w:val="24"/>
+        </w:rPr>
+        <w:t xml:space="preserve"> </w:t>
+      </w:r>
+      <w:r>
+        <w:rPr>
+          <w:rFonts w:ascii="宋体" w:eastAsia="宋体" w:hAnsi="宋体" w:cs="Times New Roman"/>
+          <w:color w:val="000000" w:themeColor="text1"/>
+          <w:sz w:val="24"/>
+          <w:szCs w:val="24"/>
+        </w:rPr>
+        <w:t>magnetic compass sense.</w:t>
+      </w:r>
+      <w:r>
+        <w:rPr>
+          <w:rFonts w:ascii="宋体" w:eastAsia="宋体" w:hAnsi="宋体" w:cs="Times New Roman"/>
+          <w:color w:val="000000" w:themeColor="text1"/>
+          <w:sz w:val="24"/>
+          <w:szCs w:val="24"/>
+        </w:rPr>
+        <w:t xml:space="preserve"> </w:t>
+      </w:r>
+    </w:p>
+    <w:p>
+      <w:pPr>
+        <w:rPr>
+          <w:rFonts w:ascii="宋体" w:eastAsia="宋体" w:hAnsi="宋体" w:cs="Times New Roman"/>
+          <w:color w:val="000000" w:themeColor="text1"/>
+          <w:sz w:val="24"/>
+          <w:szCs w:val="24"/>
+        </w:rPr>
+      </w:pPr>
+      <w:r>
+        <w:rPr>
+          <w:rFonts w:ascii="宋体" w:eastAsia="宋体" w:hAnsi="宋体" w:cs="Times New Roman" w:hint="eastAsia"/>
+          <w:color w:val="000000" w:themeColor="text1"/>
+          <w:sz w:val="24"/>
+          <w:szCs w:val="24"/>
+        </w:rPr>
+        <w:t>或者关注我发现受选择的可能和磁感应相关的基因是否与这个基因有关系。</w:t>
+      </w:r>
+    </w:p>
+    <w:p>
+      <w:pPr>
+        <w:rPr>
+          <w:rFonts w:ascii="宋体" w:eastAsia="宋体" w:hAnsi="宋体" w:cs="Times New Roman" w:hint="eastAsia"/>
+          <w:color w:val="000000" w:themeColor="text1"/>
+          <w:sz w:val="24"/>
+          <w:szCs w:val="24"/>
+        </w:rPr>
+      </w:pPr>
+      <w:r>
+        <w:rPr>
+          <w:rFonts w:ascii="宋体" w:eastAsia="宋体" w:hAnsi="宋体" w:cs="Times New Roman" w:hint="eastAsia"/>
+          <w:color w:val="000000" w:themeColor="text1"/>
+          <w:sz w:val="24"/>
+          <w:szCs w:val="24"/>
+        </w:rPr>
+        <w:t>因为选择可能很早就发生了，这个基因的功能很早就已经成型，那么围绕这个基因的周围的功能可能在处在选择进行中。</w:t>
+      </w:r>
+    </w:p>
     <w:sectPr>
       <w:pgSz w:w="11906" w:h="16838"/>
       <w:pgMar w:top="1440" w:right="1800" w:bottom="1440" w:left="1800" w:header="851" w:footer="992" w:gutter="0"/>
@@ -3170,7 +2719,7 @@
 </file>
 
 <file path=word/endnotes.xml><?xml version="1.0" encoding="utf-8"?>
-<w:endnotes xmlns:wpc="http://schemas.microsoft.com/office/word/2010/wordprocessingCanvas" xmlns:cx="http://schemas.microsoft.com/office/drawing/2014/chartex" xmlns:cx1="http://schemas.microsoft.com/office/drawing/2015/9/8/chartex" xmlns:cx2="http://schemas.microsoft.com/office/drawing/2015/10/21/chartex" xmlns:cx3="http://schemas.microsoft.com/office/drawing/2016/5/9/chartex" xmlns:cx4="http://schemas.microsoft.com/office/drawing/2016/5/10/chartex" xmlns:cx5="http://schemas.microsoft.com/office/drawing/2016/5/11/chartex" xmlns:cx6="http://schemas.microsoft.com/office/drawing/2016/5/12/chartex" xmlns:cx7="http://schemas.microsoft.com/office/drawing/2016/5/13/chartex" xmlns:cx8="http://schemas.microsoft.com/office/drawing/2016/5/14/chartex" xmlns:mc="http://schemas.openxmlformats.org/markup-compatibility/2006" xmlns:aink="http://schemas.microsoft.com/office/drawing/2016/ink" xmlns:am3d="http://schemas.microsoft.com/office/drawing/2017/model3d" xmlns:o="urn:schemas-microsoft-com:office:office" xmlns:r="http://schemas.openxmlformats.org/officeDocument/2006/relationships" xmlns:m="http://schemas.openxmlformats.org/officeDocument/2006/math" xmlns:v="urn:schemas-microsoft-com:vml" xmlns:wp14="http://schemas.microsoft.com/office/word/2010/wordprocessingDrawing" xmlns:wp="http://schemas.openxmlformats.org/drawingml/2006/wordprocessingDrawing" xmlns:w10="urn:schemas-microsoft-com:office:word" xmlns:w="http://schemas.openxmlformats.org/wordprocessingml/2006/main" xmlns:w14="http://schemas.microsoft.com/office/word/2010/wordml" xmlns:w15="http://schemas.microsoft.com/office/word/2012/wordml" xmlns:w16cid="http://schemas.microsoft.com/office/word/2016/wordml/cid" xmlns:w16se="http://schemas.microsoft.com/office/word/2015/wordml/symex" xmlns:wpg="http://schemas.microsoft.com/office/word/2010/wordprocessingGroup" xmlns:wpi="http://schemas.microsoft.com/office/word/2010/wordprocessingInk" xmlns:wne="http://schemas.microsoft.com/office/word/2006/wordml" xmlns:wps="http://schemas.microsoft.com/office/word/2010/wordprocessingShape" mc:Ignorable="w14 w15 w16se w16cid wp14">
+<w:endnotes xmlns:wpc="http://schemas.microsoft.com/office/word/2010/wordprocessingCanvas" xmlns:cx="http://schemas.microsoft.com/office/drawing/2014/chartex" xmlns:cx1="http://schemas.microsoft.com/office/drawing/2015/9/8/chartex" xmlns:cx2="http://schemas.microsoft.com/office/drawing/2015/10/21/chartex" xmlns:cx3="http://schemas.microsoft.com/office/drawing/2016/5/9/chartex" xmlns:cx4="http://schemas.microsoft.com/office/drawing/2016/5/10/chartex" xmlns:cx5="http://schemas.microsoft.com/office/drawing/2016/5/11/chartex" xmlns:cx6="http://schemas.microsoft.com/office/drawing/2016/5/12/chartex" xmlns:cx7="http://schemas.microsoft.com/office/drawing/2016/5/13/chartex" xmlns:cx8="http://schemas.microsoft.com/office/drawing/2016/5/14/chartex" xmlns:mc="http://schemas.openxmlformats.org/markup-compatibility/2006" xmlns:aink="http://schemas.microsoft.com/office/drawing/2016/ink" xmlns:am3d="http://schemas.microsoft.com/office/drawing/2017/model3d" xmlns:o="urn:schemas-microsoft-com:office:office" xmlns:r="http://schemas.openxmlformats.org/officeDocument/2006/relationships" xmlns:m="http://schemas.openxmlformats.org/officeDocument/2006/math" xmlns:v="urn:schemas-microsoft-com:vml" xmlns:wp14="http://schemas.microsoft.com/office/word/2010/wordprocessingDrawing" xmlns:wp="http://schemas.openxmlformats.org/drawingml/2006/wordprocessingDrawing" xmlns:w10="urn:schemas-microsoft-com:office:word" xmlns:w="http://schemas.openxmlformats.org/wordprocessingml/2006/main" xmlns:w14="http://schemas.microsoft.com/office/word/2010/wordml" xmlns:w15="http://schemas.microsoft.com/office/word/2012/wordml" xmlns:w16cex="http://schemas.microsoft.com/office/word/2018/wordml/cex" xmlns:w16cid="http://schemas.microsoft.com/office/word/2016/wordml/cid" xmlns:w16="http://schemas.microsoft.com/office/word/2018/wordml" xmlns:w16sdtdh="http://schemas.microsoft.com/office/word/2020/wordml/sdtdatahash" xmlns:w16se="http://schemas.microsoft.com/office/word/2015/wordml/symex" xmlns:wpg="http://schemas.microsoft.com/office/word/2010/wordprocessingGroup" xmlns:wpi="http://schemas.microsoft.com/office/word/2010/wordprocessingInk" xmlns:wne="http://schemas.microsoft.com/office/word/2006/wordml" xmlns:wps="http://schemas.microsoft.com/office/word/2010/wordprocessingShape" mc:Ignorable="w14 w15 w16se w16cid w16 w16cex w16sdtdh wp14">
   <w:endnote w:type="separator" w:id="-1">
     <w:p>
       <w:r>
@@ -3189,7 +2738,7 @@
 </file>
 
 <file path=word/footnotes.xml><?xml version="1.0" encoding="utf-8"?>
-<w:footnotes xmlns:wpc="http://schemas.microsoft.com/office/word/2010/wordprocessingCanvas" xmlns:cx="http://schemas.microsoft.com/office/drawing/2014/chartex" xmlns:cx1="http://schemas.microsoft.com/office/drawing/2015/9/8/chartex" xmlns:cx2="http://schemas.microsoft.com/office/drawing/2015/10/21/chartex" xmlns:cx3="http://schemas.microsoft.com/office/drawing/2016/5/9/chartex" xmlns:cx4="http://schemas.microsoft.com/office/drawing/2016/5/10/chartex" xmlns:cx5="http://schemas.microsoft.com/office/drawing/2016/5/11/chartex" xmlns:cx6="http://schemas.microsoft.com/office/drawing/2016/5/12/chartex" xmlns:cx7="http://schemas.microsoft.com/office/drawing/2016/5/13/chartex" xmlns:cx8="http://schemas.microsoft.com/office/drawing/2016/5/14/chartex" xmlns:mc="http://schemas.openxmlformats.org/markup-compatibility/2006" xmlns:aink="http://schemas.microsoft.com/office/drawing/2016/ink" xmlns:am3d="http://schemas.microsoft.com/office/drawing/2017/model3d" xmlns:o="urn:schemas-microsoft-com:office:office" xmlns:r="http://schemas.openxmlformats.org/officeDocument/2006/relationships" xmlns:m="http://schemas.openxmlformats.org/officeDocument/2006/math" xmlns:v="urn:schemas-microsoft-com:vml" xmlns:wp14="http://schemas.microsoft.com/office/word/2010/wordprocessingDrawing" xmlns:wp="http://schemas.openxmlformats.org/drawingml/2006/wordprocessingDrawing" xmlns:w10="urn:schemas-microsoft-com:office:word" xmlns:w="http://schemas.openxmlformats.org/wordprocessingml/2006/main" xmlns:w14="http://schemas.microsoft.com/office/word/2010/wordml" xmlns:w15="http://schemas.microsoft.com/office/word/2012/wordml" xmlns:w16cid="http://schemas.microsoft.com/office/word/2016/wordml/cid" xmlns:w16se="http://schemas.microsoft.com/office/word/2015/wordml/symex" xmlns:wpg="http://schemas.microsoft.com/office/word/2010/wordprocessingGroup" xmlns:wpi="http://schemas.microsoft.com/office/word/2010/wordprocessingInk" xmlns:wne="http://schemas.microsoft.com/office/word/2006/wordml" xmlns:wps="http://schemas.microsoft.com/office/word/2010/wordprocessingShape" mc:Ignorable="w14 w15 w16se w16cid wp14">
+<w:footnotes xmlns:wpc="http://schemas.microsoft.com/office/word/2010/wordprocessingCanvas" xmlns:cx="http://schemas.microsoft.com/office/drawing/2014/chartex" xmlns:cx1="http://schemas.microsoft.com/office/drawing/2015/9/8/chartex" xmlns:cx2="http://schemas.microsoft.com/office/drawing/2015/10/21/chartex" xmlns:cx3="http://schemas.microsoft.com/office/drawing/2016/5/9/chartex" xmlns:cx4="http://schemas.microsoft.com/office/drawing/2016/5/10/chartex" xmlns:cx5="http://schemas.microsoft.com/office/drawing/2016/5/11/chartex" xmlns:cx6="http://schemas.microsoft.com/office/drawing/2016/5/12/chartex" xmlns:cx7="http://schemas.microsoft.com/office/drawing/2016/5/13/chartex" xmlns:cx8="http://schemas.microsoft.com/office/drawing/2016/5/14/chartex" xmlns:mc="http://schemas.openxmlformats.org/markup-compatibility/2006" xmlns:aink="http://schemas.microsoft.com/office/drawing/2016/ink" xmlns:am3d="http://schemas.microsoft.com/office/drawing/2017/model3d" xmlns:o="urn:schemas-microsoft-com:office:office" xmlns:r="http://schemas.openxmlformats.org/officeDocument/2006/relationships" xmlns:m="http://schemas.openxmlformats.org/officeDocument/2006/math" xmlns:v="urn:schemas-microsoft-com:vml" xmlns:wp14="http://schemas.microsoft.com/office/word/2010/wordprocessingDrawing" xmlns:wp="http://schemas.openxmlformats.org/drawingml/2006/wordprocessingDrawing" xmlns:w10="urn:schemas-microsoft-com:office:word" xmlns:w="http://schemas.openxmlformats.org/wordprocessingml/2006/main" xmlns:w14="http://schemas.microsoft.com/office/word/2010/wordml" xmlns:w15="http://schemas.microsoft.com/office/word/2012/wordml" xmlns:w16cex="http://schemas.microsoft.com/office/word/2018/wordml/cex" xmlns:w16cid="http://schemas.microsoft.com/office/word/2016/wordml/cid" xmlns:w16="http://schemas.microsoft.com/office/word/2018/wordml" xmlns:w16sdtdh="http://schemas.microsoft.com/office/word/2020/wordml/sdtdatahash" xmlns:w16se="http://schemas.microsoft.com/office/word/2015/wordml/symex" xmlns:wpg="http://schemas.microsoft.com/office/word/2010/wordprocessingGroup" xmlns:wpi="http://schemas.microsoft.com/office/word/2010/wordprocessingInk" xmlns:wne="http://schemas.microsoft.com/office/word/2006/wordml" xmlns:wps="http://schemas.microsoft.com/office/word/2010/wordprocessingShape" mc:Ignorable="w14 w15 w16se w16cid w16 w16cex w16sdtdh wp14">
   <w:footnote w:type="separator" w:id="-1">
     <w:p>
       <w:r>
@@ -3208,7 +2757,7 @@
 </file>
 
 <file path=word/numbering.xml><?xml version="1.0" encoding="utf-8"?>
-<w:numbering xmlns:wpc="http://schemas.microsoft.com/office/word/2010/wordprocessingCanvas" xmlns:cx="http://schemas.microsoft.com/office/drawing/2014/chartex" xmlns:cx1="http://schemas.microsoft.com/office/drawing/2015/9/8/chartex" xmlns:cx2="http://schemas.microsoft.com/office/drawing/2015/10/21/chartex" xmlns:cx3="http://schemas.microsoft.com/office/drawing/2016/5/9/chartex" xmlns:cx4="http://schemas.microsoft.com/office/drawing/2016/5/10/chartex" xmlns:cx5="http://schemas.microsoft.com/office/drawing/2016/5/11/chartex" xmlns:cx6="http://schemas.microsoft.com/office/drawing/2016/5/12/chartex" xmlns:cx7="http://schemas.microsoft.com/office/drawing/2016/5/13/chartex" xmlns:cx8="http://schemas.microsoft.com/office/drawing/2016/5/14/chartex" xmlns:mc="http://schemas.openxmlformats.org/markup-compatibility/2006" xmlns:aink="http://schemas.microsoft.com/office/drawing/2016/ink" xmlns:am3d="http://schemas.microsoft.com/office/drawing/2017/model3d" xmlns:o="urn:schemas-microsoft-com:office:office" xmlns:r="http://schemas.openxmlformats.org/officeDocument/2006/relationships" xmlns:m="http://schemas.openxmlformats.org/officeDocument/2006/math" xmlns:v="urn:schemas-microsoft-com:vml" xmlns:wp14="http://schemas.microsoft.com/office/word/2010/wordprocessingDrawing" xmlns:wp="http://schemas.openxmlformats.org/drawingml/2006/wordprocessingDrawing" xmlns:w10="urn:schemas-microsoft-com:office:word" xmlns:w="http://schemas.openxmlformats.org/wordprocessingml/2006/main" xmlns:w14="http://schemas.microsoft.com/office/word/2010/wordml" xmlns:w15="http://schemas.microsoft.com/office/word/2012/wordml" xmlns:w16cid="http://schemas.microsoft.com/office/word/2016/wordml/cid" xmlns:w16se="http://schemas.microsoft.com/office/word/2015/wordml/symex" xmlns:wpg="http://schemas.microsoft.com/office/word/2010/wordprocessingGroup" xmlns:wpi="http://schemas.microsoft.com/office/word/2010/wordprocessingInk" xmlns:wne="http://schemas.microsoft.com/office/word/2006/wordml" xmlns:wps="http://schemas.microsoft.com/office/word/2010/wordprocessingShape" mc:Ignorable="w14 w15 w16se w16cid wp14">
+<w:numbering xmlns:wpc="http://schemas.microsoft.com/office/word/2010/wordprocessingCanvas" xmlns:cx="http://schemas.microsoft.com/office/drawing/2014/chartex" xmlns:cx1="http://schemas.microsoft.com/office/drawing/2015/9/8/chartex" xmlns:cx2="http://schemas.microsoft.com/office/drawing/2015/10/21/chartex" xmlns:cx3="http://schemas.microsoft.com/office/drawing/2016/5/9/chartex" xmlns:cx4="http://schemas.microsoft.com/office/drawing/2016/5/10/chartex" xmlns:cx5="http://schemas.microsoft.com/office/drawing/2016/5/11/chartex" xmlns:cx6="http://schemas.microsoft.com/office/drawing/2016/5/12/chartex" xmlns:cx7="http://schemas.microsoft.com/office/drawing/2016/5/13/chartex" xmlns:cx8="http://schemas.microsoft.com/office/drawing/2016/5/14/chartex" xmlns:mc="http://schemas.openxmlformats.org/markup-compatibility/2006" xmlns:aink="http://schemas.microsoft.com/office/drawing/2016/ink" xmlns:am3d="http://schemas.microsoft.com/office/drawing/2017/model3d" xmlns:o="urn:schemas-microsoft-com:office:office" xmlns:r="http://schemas.openxmlformats.org/officeDocument/2006/relationships" xmlns:m="http://schemas.openxmlformats.org/officeDocument/2006/math" xmlns:v="urn:schemas-microsoft-com:vml" xmlns:wp14="http://schemas.microsoft.com/office/word/2010/wordprocessingDrawing" xmlns:wp="http://schemas.openxmlformats.org/drawingml/2006/wordprocessingDrawing" xmlns:w10="urn:schemas-microsoft-com:office:word" xmlns:w="http://schemas.openxmlformats.org/wordprocessingml/2006/main" xmlns:w14="http://schemas.microsoft.com/office/word/2010/wordml" xmlns:w15="http://schemas.microsoft.com/office/word/2012/wordml" xmlns:w16cex="http://schemas.microsoft.com/office/word/2018/wordml/cex" xmlns:w16cid="http://schemas.microsoft.com/office/word/2016/wordml/cid" xmlns:w16="http://schemas.microsoft.com/office/word/2018/wordml" xmlns:w16sdtdh="http://schemas.microsoft.com/office/word/2020/wordml/sdtdatahash" xmlns:w16se="http://schemas.microsoft.com/office/word/2015/wordml/symex" xmlns:wpg="http://schemas.microsoft.com/office/word/2010/wordprocessingGroup" xmlns:wpi="http://schemas.microsoft.com/office/word/2010/wordprocessingInk" xmlns:wne="http://schemas.microsoft.com/office/word/2006/wordml" xmlns:wps="http://schemas.microsoft.com/office/word/2010/wordprocessingShape" mc:Ignorable="w14 w15 w16se w16cid w16 w16cex w16sdtdh wp14">
   <w:abstractNum w:abstractNumId="0" w15:restartNumberingAfterBreak="0">
     <w:nsid w:val="30E879CA"/>
     <w:multiLevelType w:val="hybridMultilevel"/>
@@ -3305,7 +2854,7 @@
 </file>
 
 <file path=word/styles.xml><?xml version="1.0" encoding="utf-8"?>
-<w:styles xmlns:mc="http://schemas.openxmlformats.org/markup-compatibility/2006" xmlns:r="http://schemas.openxmlformats.org/officeDocument/2006/relationships" xmlns:w="http://schemas.openxmlformats.org/wordprocessingml/2006/main" xmlns:w14="http://schemas.microsoft.com/office/word/2010/wordml" xmlns:w15="http://schemas.microsoft.com/office/word/2012/wordml" xmlns:w16cid="http://schemas.microsoft.com/office/word/2016/wordml/cid" xmlns:w16se="http://schemas.microsoft.com/office/word/2015/wordml/symex" mc:Ignorable="w14 w15 w16se w16cid">
+<w:styles xmlns:mc="http://schemas.openxmlformats.org/markup-compatibility/2006" xmlns:r="http://schemas.openxmlformats.org/officeDocument/2006/relationships" xmlns:w="http://schemas.openxmlformats.org/wordprocessingml/2006/main" xmlns:w14="http://schemas.microsoft.com/office/word/2010/wordml" xmlns:w15="http://schemas.microsoft.com/office/word/2012/wordml" xmlns:w16cex="http://schemas.microsoft.com/office/word/2018/wordml/cex" xmlns:w16cid="http://schemas.microsoft.com/office/word/2016/wordml/cid" xmlns:w16="http://schemas.microsoft.com/office/word/2018/wordml" xmlns:w16sdtdh="http://schemas.microsoft.com/office/word/2020/wordml/sdtdatahash" xmlns:w16se="http://schemas.microsoft.com/office/word/2015/wordml/symex" mc:Ignorable="w14 w15 w16se w16cid w16 w16cex w16sdtdh">
   <w:docDefaults>
     <w:rPrDefault>
       <w:rPr>
@@ -3882,6 +3431,27 @@
       <w:sz w:val="20"/>
     </w:rPr>
   </w:style>
+  <w:style w:type="paragraph" w:styleId="aa">
+    <w:name w:val="Date"/>
+    <w:basedOn w:val="a"/>
+    <w:next w:val="a"/>
+    <w:link w:val="ab"/>
+    <w:uiPriority w:val="99"/>
+    <w:semiHidden/>
+    <w:unhideWhenUsed/>
+    <w:rsid w:val="009B5E68"/>
+    <w:pPr>
+      <w:ind w:leftChars="2500" w:left="100"/>
+    </w:pPr>
+  </w:style>
+  <w:style w:type="character" w:customStyle="1" w:styleId="ab">
+    <w:name w:val="日期 字符"/>
+    <w:basedOn w:val="a0"/>
+    <w:link w:val="aa"/>
+    <w:uiPriority w:val="99"/>
+    <w:semiHidden/>
+    <w:rsid w:val="009B5E68"/>
+  </w:style>
 </w:styles>
 </file>
 

</xml_diff>

<commit_message>
need a new repository; slidingwindowFormaf.py done, running ok
</commit_message>
<xml_diff>
--- a/MS/molecular ecology之后/重写备忘录.docx
+++ b/MS/molecular ecology之后/重写备忘录.docx
@@ -18,7 +18,187 @@
           <w:szCs w:val="21"/>
           <w:shd w:val="clear" w:color="auto" w:fill="FFFFFF"/>
         </w:rPr>
-        <w:t>传统的观点认为家鸭是起源于绿头野鸭或绿头野鸭和斑嘴野鸭的杂交后代，这个依据主要是外形及习性的相似以及栖息地的分布。关于驯化（主要是动物），传统的观点认为是由人类主导的选择野生动物驯养并演化成为驯化动物的过程。但是越来越多的研究发现传统的驯化假设和遗传数据并不相符。我们通过PCA，IBS进化树等分析发现相较于其他野鸭品种，绿头野鸭和斑嘴野鸭确实在遗传特征上和家鸭更为相似，进化关系也更接近。但是F3统计量分析并不支持家鸭是绿头和斑嘴杂交后代的假设，然而进化关系尤其是SNP分布的分析却表明家鸭和野鸭具有相比拟的亲缘关系。进而通过genetic structure的分析发现绿头野鸭和斑嘴野鸭的分化可能晚于他们的祖先和家鸭祖先的分化，而这一进化关系逻辑上也可以满足包括F3统计量和SNP分布在内的前述分析结果。进而我们通过dadi模拟群体历史，结果支持了家鸭祖先和野鸭祖先先分化，野鸭再分化为绿头和斑嘴的假设。同时PSMC的分析暗示出野鸭和家鸭分化的时间和dadi模拟得出的时间相吻合，PSMC还显示出野鸭在与家鸭祖先分化之后群体大小持续降低，随后dadi的模拟显示出和PSMC相同的群体大小变化趋势。 </w:t>
+        <w:t>传统的观点认为家鸭是起源于绿头野鸭或绿头野鸭</w:t>
+      </w:r>
+      <w:proofErr w:type="gramStart"/>
+      <w:r>
+        <w:rPr>
+          <w:rFonts w:ascii="宋体" w:eastAsia="宋体" w:hAnsi="宋体" w:cs="Arial"/>
+          <w:color w:val="000000"/>
+          <w:szCs w:val="21"/>
+          <w:shd w:val="clear" w:color="auto" w:fill="FFFFFF"/>
+        </w:rPr>
+        <w:t>和斑嘴野鸭</w:t>
+      </w:r>
+      <w:proofErr w:type="gramEnd"/>
+      <w:r>
+        <w:rPr>
+          <w:rFonts w:ascii="宋体" w:eastAsia="宋体" w:hAnsi="宋体" w:cs="Arial"/>
+          <w:color w:val="000000"/>
+          <w:szCs w:val="21"/>
+          <w:shd w:val="clear" w:color="auto" w:fill="FFFFFF"/>
+        </w:rPr>
+        <w:t>的杂交后代，这个依据主要是外形及习性的相似以及栖息地的分布。关于驯化（主要是动物），传统的观点认为是由人类主导的选择野生动物驯养并演化成为驯化动物的过程。但是越来越多的研究发现传统的驯化假设和遗传数据并不相符。我们通过PCA，IBS进化树等分析发现相较于其他野鸭品种，绿头野鸭</w:t>
+      </w:r>
+      <w:proofErr w:type="gramStart"/>
+      <w:r>
+        <w:rPr>
+          <w:rFonts w:ascii="宋体" w:eastAsia="宋体" w:hAnsi="宋体" w:cs="Arial"/>
+          <w:color w:val="000000"/>
+          <w:szCs w:val="21"/>
+          <w:shd w:val="clear" w:color="auto" w:fill="FFFFFF"/>
+        </w:rPr>
+        <w:t>和斑嘴野鸭</w:t>
+      </w:r>
+      <w:proofErr w:type="gramEnd"/>
+      <w:r>
+        <w:rPr>
+          <w:rFonts w:ascii="宋体" w:eastAsia="宋体" w:hAnsi="宋体" w:cs="Arial"/>
+          <w:color w:val="000000"/>
+          <w:szCs w:val="21"/>
+          <w:shd w:val="clear" w:color="auto" w:fill="FFFFFF"/>
+        </w:rPr>
+        <w:t>确实在遗传特征上和家鸭更为相似，进化关系也更接近。但是F3统计量分析并不支持家鸭是绿头</w:t>
+      </w:r>
+      <w:proofErr w:type="gramStart"/>
+      <w:r>
+        <w:rPr>
+          <w:rFonts w:ascii="宋体" w:eastAsia="宋体" w:hAnsi="宋体" w:cs="Arial"/>
+          <w:color w:val="000000"/>
+          <w:szCs w:val="21"/>
+          <w:shd w:val="clear" w:color="auto" w:fill="FFFFFF"/>
+        </w:rPr>
+        <w:t>和斑嘴杂交</w:t>
+      </w:r>
+      <w:proofErr w:type="gramEnd"/>
+      <w:r>
+        <w:rPr>
+          <w:rFonts w:ascii="宋体" w:eastAsia="宋体" w:hAnsi="宋体" w:cs="Arial"/>
+          <w:color w:val="000000"/>
+          <w:szCs w:val="21"/>
+          <w:shd w:val="clear" w:color="auto" w:fill="FFFFFF"/>
+        </w:rPr>
+        <w:t>后代的假设，然而进化关系尤其是SNP分布的分析却表明家鸭和野鸭具有相比拟的亲缘关系。进而通过genetic structure的分析发现绿头野鸭</w:t>
+      </w:r>
+      <w:proofErr w:type="gramStart"/>
+      <w:r>
+        <w:rPr>
+          <w:rFonts w:ascii="宋体" w:eastAsia="宋体" w:hAnsi="宋体" w:cs="Arial"/>
+          <w:color w:val="000000"/>
+          <w:szCs w:val="21"/>
+          <w:shd w:val="clear" w:color="auto" w:fill="FFFFFF"/>
+        </w:rPr>
+        <w:t>和斑嘴野鸭</w:t>
+      </w:r>
+      <w:proofErr w:type="gramEnd"/>
+      <w:r>
+        <w:rPr>
+          <w:rFonts w:ascii="宋体" w:eastAsia="宋体" w:hAnsi="宋体" w:cs="Arial"/>
+          <w:color w:val="000000"/>
+          <w:szCs w:val="21"/>
+          <w:shd w:val="clear" w:color="auto" w:fill="FFFFFF"/>
+        </w:rPr>
+        <w:t>的分化可能晚于他们的祖先和家鸭祖先的分化，而这一进化关系逻辑上也可以满足包括F3统计量和SNP分布在内的前述分析结果。进而我们通过</w:t>
+      </w:r>
+      <w:proofErr w:type="spellStart"/>
+      <w:r>
+        <w:rPr>
+          <w:rFonts w:ascii="宋体" w:eastAsia="宋体" w:hAnsi="宋体" w:cs="Arial"/>
+          <w:color w:val="000000"/>
+          <w:szCs w:val="21"/>
+          <w:shd w:val="clear" w:color="auto" w:fill="FFFFFF"/>
+        </w:rPr>
+        <w:t>dadi</w:t>
+      </w:r>
+      <w:proofErr w:type="spellEnd"/>
+      <w:r>
+        <w:rPr>
+          <w:rFonts w:ascii="宋体" w:eastAsia="宋体" w:hAnsi="宋体" w:cs="Arial"/>
+          <w:color w:val="000000"/>
+          <w:szCs w:val="21"/>
+          <w:shd w:val="clear" w:color="auto" w:fill="FFFFFF"/>
+        </w:rPr>
+        <w:t>模拟群体历史，结果支持了家鸭祖先和野鸭祖先</w:t>
+      </w:r>
+      <w:proofErr w:type="gramStart"/>
+      <w:r>
+        <w:rPr>
+          <w:rFonts w:ascii="宋体" w:eastAsia="宋体" w:hAnsi="宋体" w:cs="Arial"/>
+          <w:color w:val="000000"/>
+          <w:szCs w:val="21"/>
+          <w:shd w:val="clear" w:color="auto" w:fill="FFFFFF"/>
+        </w:rPr>
+        <w:t>先</w:t>
+      </w:r>
+      <w:proofErr w:type="gramEnd"/>
+      <w:r>
+        <w:rPr>
+          <w:rFonts w:ascii="宋体" w:eastAsia="宋体" w:hAnsi="宋体" w:cs="Arial"/>
+          <w:color w:val="000000"/>
+          <w:szCs w:val="21"/>
+          <w:shd w:val="clear" w:color="auto" w:fill="FFFFFF"/>
+        </w:rPr>
+        <w:t>分化，野鸭再分化为绿头</w:t>
+      </w:r>
+      <w:proofErr w:type="gramStart"/>
+      <w:r>
+        <w:rPr>
+          <w:rFonts w:ascii="宋体" w:eastAsia="宋体" w:hAnsi="宋体" w:cs="Arial"/>
+          <w:color w:val="000000"/>
+          <w:szCs w:val="21"/>
+          <w:shd w:val="clear" w:color="auto" w:fill="FFFFFF"/>
+        </w:rPr>
+        <w:t>和斑嘴的</w:t>
+      </w:r>
+      <w:proofErr w:type="gramEnd"/>
+      <w:r>
+        <w:rPr>
+          <w:rFonts w:ascii="宋体" w:eastAsia="宋体" w:hAnsi="宋体" w:cs="Arial"/>
+          <w:color w:val="000000"/>
+          <w:szCs w:val="21"/>
+          <w:shd w:val="clear" w:color="auto" w:fill="FFFFFF"/>
+        </w:rPr>
+        <w:t>假设。同时PSMC的分析暗示出野鸭和家鸭分化的时间和</w:t>
+      </w:r>
+      <w:proofErr w:type="spellStart"/>
+      <w:r>
+        <w:rPr>
+          <w:rFonts w:ascii="宋体" w:eastAsia="宋体" w:hAnsi="宋体" w:cs="Arial"/>
+          <w:color w:val="000000"/>
+          <w:szCs w:val="21"/>
+          <w:shd w:val="clear" w:color="auto" w:fill="FFFFFF"/>
+        </w:rPr>
+        <w:t>dadi</w:t>
+      </w:r>
+      <w:proofErr w:type="spellEnd"/>
+      <w:r>
+        <w:rPr>
+          <w:rFonts w:ascii="宋体" w:eastAsia="宋体" w:hAnsi="宋体" w:cs="Arial"/>
+          <w:color w:val="000000"/>
+          <w:szCs w:val="21"/>
+          <w:shd w:val="clear" w:color="auto" w:fill="FFFFFF"/>
+        </w:rPr>
+        <w:t>模拟得出的时间相吻合，PSMC还显示出野鸭在与家鸭祖先分化之后群体大小持续降低，随后</w:t>
+      </w:r>
+      <w:proofErr w:type="spellStart"/>
+      <w:r>
+        <w:rPr>
+          <w:rFonts w:ascii="宋体" w:eastAsia="宋体" w:hAnsi="宋体" w:cs="Arial"/>
+          <w:color w:val="000000"/>
+          <w:szCs w:val="21"/>
+          <w:shd w:val="clear" w:color="auto" w:fill="FFFFFF"/>
+        </w:rPr>
+        <w:t>dadi</w:t>
+      </w:r>
+      <w:proofErr w:type="spellEnd"/>
+      <w:r>
+        <w:rPr>
+          <w:rFonts w:ascii="宋体" w:eastAsia="宋体" w:hAnsi="宋体" w:cs="Arial"/>
+          <w:color w:val="000000"/>
+          <w:szCs w:val="21"/>
+          <w:shd w:val="clear" w:color="auto" w:fill="FFFFFF"/>
+        </w:rPr>
+        <w:t>的模拟显示出和PSMC相同的群体大小变化趋势。 </w:t>
       </w:r>
     </w:p>
     <w:p>
@@ -159,18 +339,9 @@
           <w:szCs w:val="21"/>
           <w:shd w:val="clear" w:color="auto" w:fill="FFFFFF"/>
         </w:rPr>
-        <w:t>类型，这个工作相对耗时而且复杂，因此，打算先将就用之前的结果，投文章同时进行重新分析！</w:t>
-      </w:r>
-    </w:p>
-    <w:p>
-      <w:pPr>
-        <w:rPr>
-          <w:rFonts w:ascii="宋体" w:eastAsia="宋体" w:hAnsi="宋体" w:cs="Arial"/>
-          <w:color w:val="000000"/>
-          <w:szCs w:val="21"/>
-          <w:shd w:val="clear" w:color="auto" w:fill="FFFFFF"/>
-        </w:rPr>
-      </w:pPr>
+        <w:t>类型，这个工作相对耗时而且复杂，因此，打算先将就</w:t>
+      </w:r>
+      <w:proofErr w:type="gramStart"/>
       <w:r>
         <w:rPr>
           <w:rFonts w:ascii="宋体" w:eastAsia="宋体" w:hAnsi="宋体" w:cs="Arial" w:hint="eastAsia"/>
@@ -178,8 +349,58 @@
           <w:szCs w:val="21"/>
           <w:shd w:val="clear" w:color="auto" w:fill="FFFFFF"/>
         </w:rPr>
+        <w:t>用之前</w:t>
+      </w:r>
+      <w:proofErr w:type="gramEnd"/>
+      <w:r>
+        <w:rPr>
+          <w:rFonts w:ascii="宋体" w:eastAsia="宋体" w:hAnsi="宋体" w:cs="Arial" w:hint="eastAsia"/>
+          <w:color w:val="000000"/>
+          <w:szCs w:val="21"/>
+          <w:shd w:val="clear" w:color="auto" w:fill="FFFFFF"/>
+        </w:rPr>
+        <w:t>的结果，</w:t>
+      </w:r>
+      <w:proofErr w:type="gramStart"/>
+      <w:r>
+        <w:rPr>
+          <w:rFonts w:ascii="宋体" w:eastAsia="宋体" w:hAnsi="宋体" w:cs="Arial" w:hint="eastAsia"/>
+          <w:color w:val="000000"/>
+          <w:szCs w:val="21"/>
+          <w:shd w:val="clear" w:color="auto" w:fill="FFFFFF"/>
+        </w:rPr>
+        <w:t>投文章</w:t>
+      </w:r>
+      <w:proofErr w:type="gramEnd"/>
+      <w:r>
+        <w:rPr>
+          <w:rFonts w:ascii="宋体" w:eastAsia="宋体" w:hAnsi="宋体" w:cs="Arial" w:hint="eastAsia"/>
+          <w:color w:val="000000"/>
+          <w:szCs w:val="21"/>
+          <w:shd w:val="clear" w:color="auto" w:fill="FFFFFF"/>
+        </w:rPr>
+        <w:t>同时进行重新分析！</w:t>
+      </w:r>
+    </w:p>
+    <w:p>
+      <w:pPr>
+        <w:rPr>
+          <w:rFonts w:ascii="宋体" w:eastAsia="宋体" w:hAnsi="宋体" w:cs="Arial"/>
+          <w:color w:val="000000"/>
+          <w:szCs w:val="21"/>
+          <w:shd w:val="clear" w:color="auto" w:fill="FFFFFF"/>
+        </w:rPr>
+      </w:pPr>
+      <w:r>
+        <w:rPr>
+          <w:rFonts w:ascii="宋体" w:eastAsia="宋体" w:hAnsi="宋体" w:cs="Arial" w:hint="eastAsia"/>
+          <w:color w:val="000000"/>
+          <w:szCs w:val="21"/>
+          <w:shd w:val="clear" w:color="auto" w:fill="FFFFFF"/>
+        </w:rPr>
         <w:t>发现原在黄的服务器上的</w:t>
       </w:r>
+      <w:proofErr w:type="spellStart"/>
       <w:r>
         <w:rPr>
           <w:rFonts w:ascii="宋体" w:eastAsia="宋体" w:hAnsi="宋体" w:cs="Arial"/>
@@ -189,6 +410,7 @@
         </w:rPr>
         <w:t>mysql</w:t>
       </w:r>
+      <w:proofErr w:type="spellEnd"/>
       <w:r>
         <w:rPr>
           <w:rFonts w:ascii="宋体" w:eastAsia="宋体" w:hAnsi="宋体" w:cs="Arial" w:hint="eastAsia"/>
@@ -242,17 +464,9 @@
           <w:szCs w:val="21"/>
           <w:shd w:val="clear" w:color="auto" w:fill="FFFFFF"/>
         </w:rPr>
-        <w:t>制作m</w:t>
-      </w:r>
-      <w:r>
-        <w:rPr>
-          <w:rFonts w:ascii="宋体" w:eastAsia="宋体" w:hAnsi="宋体" w:cs="Arial"/>
-          <w:color w:val="000000"/>
-          <w:szCs w:val="21"/>
-          <w:shd w:val="clear" w:color="auto" w:fill="FFFFFF"/>
-        </w:rPr>
-        <w:t xml:space="preserve">ysql </w:t>
-      </w:r>
+        <w:t>制作</w:t>
+      </w:r>
+      <w:proofErr w:type="spellStart"/>
       <w:r>
         <w:rPr>
           <w:rFonts w:ascii="宋体" w:eastAsia="宋体" w:hAnsi="宋体" w:cs="Arial" w:hint="eastAsia"/>
@@ -260,6 +474,34 @@
           <w:szCs w:val="21"/>
           <w:shd w:val="clear" w:color="auto" w:fill="FFFFFF"/>
         </w:rPr>
+        <w:t>m</w:t>
+      </w:r>
+      <w:r>
+        <w:rPr>
+          <w:rFonts w:ascii="宋体" w:eastAsia="宋体" w:hAnsi="宋体" w:cs="Arial"/>
+          <w:color w:val="000000"/>
+          <w:szCs w:val="21"/>
+          <w:shd w:val="clear" w:color="auto" w:fill="FFFFFF"/>
+        </w:rPr>
+        <w:t>ysql</w:t>
+      </w:r>
+      <w:proofErr w:type="spellEnd"/>
+      <w:r>
+        <w:rPr>
+          <w:rFonts w:ascii="宋体" w:eastAsia="宋体" w:hAnsi="宋体" w:cs="Arial"/>
+          <w:color w:val="000000"/>
+          <w:szCs w:val="21"/>
+          <w:shd w:val="clear" w:color="auto" w:fill="FFFFFF"/>
+        </w:rPr>
+        <w:t xml:space="preserve"> </w:t>
+      </w:r>
+      <w:r>
+        <w:rPr>
+          <w:rFonts w:ascii="宋体" w:eastAsia="宋体" w:hAnsi="宋体" w:cs="Arial" w:hint="eastAsia"/>
+          <w:color w:val="000000"/>
+          <w:szCs w:val="21"/>
+          <w:shd w:val="clear" w:color="auto" w:fill="FFFFFF"/>
+        </w:rPr>
         <w:t>da</w:t>
       </w:r>
       <w:r>
@@ -362,7 +604,17 @@
           <w:szCs w:val="21"/>
           <w:shd w:val="clear" w:color="auto" w:fill="FFFFFF"/>
         </w:rPr>
-        <w:t>找一下别的v</w:t>
+        <w:t>找一下别的</w:t>
+      </w:r>
+      <w:proofErr w:type="spellStart"/>
+      <w:r>
+        <w:rPr>
+          <w:rFonts w:ascii="宋体" w:eastAsia="宋体" w:hAnsi="宋体" w:cs="Arial" w:hint="eastAsia"/>
+          <w:color w:val="000000"/>
+          <w:szCs w:val="21"/>
+          <w:shd w:val="clear" w:color="auto" w:fill="FFFFFF"/>
+        </w:rPr>
+        <w:t>v</w:t>
       </w:r>
       <w:r>
         <w:rPr>
@@ -373,6 +625,7 @@
         </w:rPr>
         <w:t>cf</w:t>
       </w:r>
+      <w:proofErr w:type="spellEnd"/>
       <w:r>
         <w:rPr>
           <w:rFonts w:ascii="宋体" w:eastAsia="宋体" w:hAnsi="宋体" w:cs="Arial" w:hint="eastAsia"/>
@@ -399,7 +652,17 @@
           <w:szCs w:val="21"/>
           <w:shd w:val="clear" w:color="auto" w:fill="FFFFFF"/>
         </w:rPr>
-        <w:t>（他妈的f</w:t>
+        <w:t>（他妈的</w:t>
+      </w:r>
+      <w:proofErr w:type="spellStart"/>
+      <w:r>
+        <w:rPr>
+          <w:rFonts w:ascii="宋体" w:eastAsia="宋体" w:hAnsi="宋体" w:cs="Arial" w:hint="eastAsia"/>
+          <w:color w:val="000000"/>
+          <w:szCs w:val="21"/>
+          <w:shd w:val="clear" w:color="auto" w:fill="FFFFFF"/>
+        </w:rPr>
+        <w:t>f</w:t>
       </w:r>
       <w:r>
         <w:rPr>
@@ -410,6 +673,7 @@
         </w:rPr>
         <w:t>y</w:t>
       </w:r>
+      <w:proofErr w:type="spellEnd"/>
       <w:r>
         <w:rPr>
           <w:rFonts w:ascii="宋体" w:eastAsia="宋体" w:hAnsi="宋体" w:cs="Arial" w:hint="eastAsia"/>
@@ -435,17 +699,9 @@
           <w:szCs w:val="21"/>
           <w:shd w:val="clear" w:color="auto" w:fill="FFFFFF"/>
         </w:rPr>
-        <w:t>访问my</w:t>
-      </w:r>
-      <w:r>
-        <w:rPr>
-          <w:rFonts w:ascii="宋体" w:eastAsia="宋体" w:hAnsi="宋体" w:cs="Arial"/>
-          <w:color w:val="000000"/>
-          <w:szCs w:val="21"/>
-          <w:shd w:val="clear" w:color="auto" w:fill="FFFFFF"/>
-        </w:rPr>
-        <w:t>sql(sqlyog</w:t>
-      </w:r>
+        <w:t>访问</w:t>
+      </w:r>
+      <w:proofErr w:type="spellStart"/>
       <w:r>
         <w:rPr>
           <w:rFonts w:ascii="宋体" w:eastAsia="宋体" w:hAnsi="宋体" w:cs="Arial" w:hint="eastAsia"/>
@@ -453,7 +709,56 @@
           <w:szCs w:val="21"/>
           <w:shd w:val="clear" w:color="auto" w:fill="FFFFFF"/>
         </w:rPr>
-        <w:t>改用了s</w:t>
+        <w:t>my</w:t>
+      </w:r>
+      <w:r>
+        <w:rPr>
+          <w:rFonts w:ascii="宋体" w:eastAsia="宋体" w:hAnsi="宋体" w:cs="Arial"/>
+          <w:color w:val="000000"/>
+          <w:szCs w:val="21"/>
+          <w:shd w:val="clear" w:color="auto" w:fill="FFFFFF"/>
+        </w:rPr>
+        <w:t>sql</w:t>
+      </w:r>
+      <w:proofErr w:type="spellEnd"/>
+      <w:r>
+        <w:rPr>
+          <w:rFonts w:ascii="宋体" w:eastAsia="宋体" w:hAnsi="宋体" w:cs="Arial"/>
+          <w:color w:val="000000"/>
+          <w:szCs w:val="21"/>
+          <w:shd w:val="clear" w:color="auto" w:fill="FFFFFF"/>
+        </w:rPr>
+        <w:t>(</w:t>
+      </w:r>
+      <w:proofErr w:type="spellStart"/>
+      <w:r>
+        <w:rPr>
+          <w:rFonts w:ascii="宋体" w:eastAsia="宋体" w:hAnsi="宋体" w:cs="Arial"/>
+          <w:color w:val="000000"/>
+          <w:szCs w:val="21"/>
+          <w:shd w:val="clear" w:color="auto" w:fill="FFFFFF"/>
+        </w:rPr>
+        <w:t>sqlyog</w:t>
+      </w:r>
+      <w:proofErr w:type="spellEnd"/>
+      <w:r>
+        <w:rPr>
+          <w:rFonts w:ascii="宋体" w:eastAsia="宋体" w:hAnsi="宋体" w:cs="Arial" w:hint="eastAsia"/>
+          <w:color w:val="000000"/>
+          <w:szCs w:val="21"/>
+          <w:shd w:val="clear" w:color="auto" w:fill="FFFFFF"/>
+        </w:rPr>
+        <w:t>改用了</w:t>
+      </w:r>
+      <w:proofErr w:type="spellStart"/>
+      <w:r>
+        <w:rPr>
+          <w:rFonts w:ascii="宋体" w:eastAsia="宋体" w:hAnsi="宋体" w:cs="Arial" w:hint="eastAsia"/>
+          <w:color w:val="000000"/>
+          <w:szCs w:val="21"/>
+          <w:shd w:val="clear" w:color="auto" w:fill="FFFFFF"/>
+        </w:rPr>
+        <w:t>s</w:t>
       </w:r>
       <w:r>
         <w:rPr>
@@ -464,6 +769,7 @@
         </w:rPr>
         <w:t>sh</w:t>
       </w:r>
+      <w:proofErr w:type="spellEnd"/>
       <w:r>
         <w:rPr>
           <w:rFonts w:ascii="宋体" w:eastAsia="宋体" w:hAnsi="宋体" w:cs="Arial" w:hint="eastAsia"/>
@@ -559,18 +865,30 @@
           <w:sz w:val="24"/>
           <w:szCs w:val="24"/>
         </w:rPr>
-        <w:t>We selected SNPs that derived allele existing (including fixed) in mallard or spotbilled</w:t>
-      </w:r>
-    </w:p>
-    <w:p>
-      <w:pPr>
-        <w:rPr>
-          <w:rFonts w:ascii="宋体" w:eastAsia="宋体" w:hAnsi="宋体" w:cs="Arial"/>
-          <w:color w:val="000000"/>
-          <w:szCs w:val="21"/>
-          <w:shd w:val="clear" w:color="auto" w:fill="FFFFFF"/>
-        </w:rPr>
-      </w:pPr>
+        <w:t xml:space="preserve">We selected SNPs that derived allele existing (including fixed) in mallard or </w:t>
+      </w:r>
+      <w:proofErr w:type="spellStart"/>
+      <w:r>
+        <w:rPr>
+          <w:rFonts w:ascii="Times New Roman" w:eastAsia="Times New Roman" w:hAnsi="Times New Roman" w:cs="Times New Roman"/>
+          <w:color w:val="000000"/>
+          <w:sz w:val="24"/>
+          <w:szCs w:val="24"/>
+        </w:rPr>
+        <w:t>spotbilled</w:t>
+      </w:r>
+      <w:proofErr w:type="spellEnd"/>
+    </w:p>
+    <w:p>
+      <w:pPr>
+        <w:rPr>
+          <w:rFonts w:ascii="宋体" w:eastAsia="宋体" w:hAnsi="宋体" w:cs="Arial"/>
+          <w:color w:val="000000"/>
+          <w:szCs w:val="21"/>
+          <w:shd w:val="clear" w:color="auto" w:fill="FFFFFF"/>
+        </w:rPr>
+      </w:pPr>
+      <w:proofErr w:type="gramStart"/>
       <w:r>
         <w:rPr>
           <w:rFonts w:ascii="宋体" w:eastAsia="宋体" w:hAnsi="宋体" w:cs="Arial" w:hint="eastAsia"/>
@@ -587,7 +905,17 @@
           <w:szCs w:val="21"/>
           <w:shd w:val="clear" w:color="auto" w:fill="FFFFFF"/>
         </w:rPr>
-        <w:t>伍总的建议：</w:t>
+        <w:t>伍总的</w:t>
+      </w:r>
+      <w:proofErr w:type="gramEnd"/>
+      <w:r>
+        <w:rPr>
+          <w:rFonts w:ascii="宋体" w:eastAsia="宋体" w:hAnsi="宋体" w:cs="Arial"/>
+          <w:color w:val="000000"/>
+          <w:szCs w:val="21"/>
+          <w:shd w:val="clear" w:color="auto" w:fill="FFFFFF"/>
+        </w:rPr>
+        <w:t>建议：</w:t>
       </w:r>
     </w:p>
     <w:p>
@@ -1404,8 +1732,9 @@
           <w:sz w:val="24"/>
           <w:szCs w:val="24"/>
         </w:rPr>
-        <w:t>Flight loss ? why not flight not acquire</w:t>
-      </w:r>
+        <w:t xml:space="preserve">Flight </w:t>
+      </w:r>
+      <w:proofErr w:type="gramStart"/>
       <w:r>
         <w:rPr>
           <w:rFonts w:ascii="宋体" w:eastAsia="宋体" w:hAnsi="宋体" w:cs="NewsGothicMTOT-Regular"/>
@@ -1414,6 +1743,27 @@
           <w:sz w:val="24"/>
           <w:szCs w:val="24"/>
         </w:rPr>
+        <w:t>loss ?</w:t>
+      </w:r>
+      <w:proofErr w:type="gramEnd"/>
+      <w:r>
+        <w:rPr>
+          <w:rFonts w:ascii="宋体" w:eastAsia="宋体" w:hAnsi="宋体" w:cs="NewsGothicMTOT-Regular"/>
+          <w:color w:val="FF0000"/>
+          <w:kern w:val="0"/>
+          <w:sz w:val="24"/>
+          <w:szCs w:val="24"/>
+        </w:rPr>
+        <w:t xml:space="preserve"> why not flight not acquire</w:t>
+      </w:r>
+      <w:r>
+        <w:rPr>
+          <w:rFonts w:ascii="宋体" w:eastAsia="宋体" w:hAnsi="宋体" w:cs="NewsGothicMTOT-Regular"/>
+          <w:color w:val="FF0000"/>
+          <w:kern w:val="0"/>
+          <w:sz w:val="24"/>
+          <w:szCs w:val="24"/>
+        </w:rPr>
         <w:t xml:space="preserve"> </w:t>
       </w:r>
       <w:r>
@@ -1535,11 +1885,10 @@
           <w:sz w:val="24"/>
           <w:szCs w:val="24"/>
         </w:rPr>
-        <w:t>有个问题要弄清楚，他们是基于什么证据说多次丧失飞行能力的。</w:t>
-      </w:r>
-    </w:p>
-    <w:p>
-      <w:pPr>
+        <w:t>有个问题要弄清楚，他们是基于什么证据</w:t>
+      </w:r>
+      <w:proofErr w:type="gramStart"/>
+      <w:r>
         <w:rPr>
           <w:rFonts w:ascii="宋体" w:eastAsia="宋体" w:hAnsi="宋体" w:cs="NewsGothicMTOT-Regular"/>
           <w:color w:val="FF0000"/>
@@ -1547,7 +1896,9 @@
           <w:sz w:val="24"/>
           <w:szCs w:val="24"/>
         </w:rPr>
-      </w:pPr>
+        <w:t>说多次</w:t>
+      </w:r>
+      <w:proofErr w:type="gramEnd"/>
       <w:r>
         <w:rPr>
           <w:rFonts w:ascii="宋体" w:eastAsia="宋体" w:hAnsi="宋体" w:cs="NewsGothicMTOT-Regular"/>
@@ -1556,7 +1907,50 @@
           <w:sz w:val="24"/>
           <w:szCs w:val="24"/>
         </w:rPr>
-        <w:t>Before we discuss about flight loss, we’d better have more comprehensive on how flight are acquire and evolved.</w:t>
+        <w:t>丧失飞行能力的。</w:t>
+      </w:r>
+    </w:p>
+    <w:p>
+      <w:pPr>
+        <w:rPr>
+          <w:rFonts w:ascii="宋体" w:eastAsia="宋体" w:hAnsi="宋体" w:cs="NewsGothicMTOT-Regular"/>
+          <w:color w:val="FF0000"/>
+          <w:kern w:val="0"/>
+          <w:sz w:val="24"/>
+          <w:szCs w:val="24"/>
+        </w:rPr>
+      </w:pPr>
+      <w:r>
+        <w:rPr>
+          <w:rFonts w:ascii="宋体" w:eastAsia="宋体" w:hAnsi="宋体" w:cs="NewsGothicMTOT-Regular"/>
+          <w:color w:val="FF0000"/>
+          <w:kern w:val="0"/>
+          <w:sz w:val="24"/>
+          <w:szCs w:val="24"/>
+        </w:rPr>
+        <w:t xml:space="preserve">Before we discuss about flight loss, we’d better have more comprehensive on how flight </w:t>
+      </w:r>
+      <w:proofErr w:type="gramStart"/>
+      <w:r>
+        <w:rPr>
+          <w:rFonts w:ascii="宋体" w:eastAsia="宋体" w:hAnsi="宋体" w:cs="NewsGothicMTOT-Regular"/>
+          <w:color w:val="FF0000"/>
+          <w:kern w:val="0"/>
+          <w:sz w:val="24"/>
+          <w:szCs w:val="24"/>
+        </w:rPr>
+        <w:t>are</w:t>
+      </w:r>
+      <w:proofErr w:type="gramEnd"/>
+      <w:r>
+        <w:rPr>
+          <w:rFonts w:ascii="宋体" w:eastAsia="宋体" w:hAnsi="宋体" w:cs="NewsGothicMTOT-Regular"/>
+          <w:color w:val="FF0000"/>
+          <w:kern w:val="0"/>
+          <w:sz w:val="24"/>
+          <w:szCs w:val="24"/>
+        </w:rPr>
+        <w:t xml:space="preserve"> acquire and evolved.</w:t>
       </w:r>
     </w:p>
     <w:p>
@@ -1616,7 +2010,178 @@
           <w:sz w:val="24"/>
           <w:szCs w:val="24"/>
         </w:rPr>
-        <w:t xml:space="preserve"> has been found imcompitet with recent research especially genetic data(greger loranze martain). It’s suggested as more a nature consequence by greger Larson et al. our founding that the domestic lineage before civilation supporte this idea. Meanwhile recent research also suggenst that the critical changes at only a few domestication loci may not the true, instead many mutations of small effect, especially those frequency </w:t>
+        <w:t xml:space="preserve"> has been found </w:t>
+      </w:r>
+      <w:proofErr w:type="spellStart"/>
+      <w:r>
+        <w:rPr>
+          <w:rFonts w:ascii="Times New Roman" w:eastAsia="Times New Roman" w:hAnsi="Times New Roman" w:cs="Times New Roman"/>
+          <w:color w:val="000000"/>
+          <w:sz w:val="24"/>
+          <w:szCs w:val="24"/>
+        </w:rPr>
+        <w:t>imcompitet</w:t>
+      </w:r>
+      <w:proofErr w:type="spellEnd"/>
+      <w:r>
+        <w:rPr>
+          <w:rFonts w:ascii="Times New Roman" w:eastAsia="Times New Roman" w:hAnsi="Times New Roman" w:cs="Times New Roman"/>
+          <w:color w:val="000000"/>
+          <w:sz w:val="24"/>
+          <w:szCs w:val="24"/>
+        </w:rPr>
+        <w:t xml:space="preserve"> with recent research especially genetic </w:t>
+      </w:r>
+      <w:proofErr w:type="gramStart"/>
+      <w:r>
+        <w:rPr>
+          <w:rFonts w:ascii="Times New Roman" w:eastAsia="Times New Roman" w:hAnsi="Times New Roman" w:cs="Times New Roman"/>
+          <w:color w:val="000000"/>
+          <w:sz w:val="24"/>
+          <w:szCs w:val="24"/>
+        </w:rPr>
+        <w:t>data(</w:t>
+      </w:r>
+      <w:proofErr w:type="spellStart"/>
+      <w:proofErr w:type="gramEnd"/>
+      <w:r>
+        <w:rPr>
+          <w:rFonts w:ascii="Times New Roman" w:eastAsia="Times New Roman" w:hAnsi="Times New Roman" w:cs="Times New Roman"/>
+          <w:color w:val="000000"/>
+          <w:sz w:val="24"/>
+          <w:szCs w:val="24"/>
+        </w:rPr>
+        <w:t>greger</w:t>
+      </w:r>
+      <w:proofErr w:type="spellEnd"/>
+      <w:r>
+        <w:rPr>
+          <w:rFonts w:ascii="Times New Roman" w:eastAsia="Times New Roman" w:hAnsi="Times New Roman" w:cs="Times New Roman"/>
+          <w:color w:val="000000"/>
+          <w:sz w:val="24"/>
+          <w:szCs w:val="24"/>
+        </w:rPr>
+        <w:t xml:space="preserve"> </w:t>
+      </w:r>
+      <w:proofErr w:type="spellStart"/>
+      <w:r>
+        <w:rPr>
+          <w:rFonts w:ascii="Times New Roman" w:eastAsia="Times New Roman" w:hAnsi="Times New Roman" w:cs="Times New Roman"/>
+          <w:color w:val="000000"/>
+          <w:sz w:val="24"/>
+          <w:szCs w:val="24"/>
+        </w:rPr>
+        <w:t>loranze</w:t>
+      </w:r>
+      <w:proofErr w:type="spellEnd"/>
+      <w:r>
+        <w:rPr>
+          <w:rFonts w:ascii="Times New Roman" w:eastAsia="Times New Roman" w:hAnsi="Times New Roman" w:cs="Times New Roman"/>
+          <w:color w:val="000000"/>
+          <w:sz w:val="24"/>
+          <w:szCs w:val="24"/>
+        </w:rPr>
+        <w:t xml:space="preserve"> </w:t>
+      </w:r>
+      <w:proofErr w:type="spellStart"/>
+      <w:r>
+        <w:rPr>
+          <w:rFonts w:ascii="Times New Roman" w:eastAsia="Times New Roman" w:hAnsi="Times New Roman" w:cs="Times New Roman"/>
+          <w:color w:val="000000"/>
+          <w:sz w:val="24"/>
+          <w:szCs w:val="24"/>
+        </w:rPr>
+        <w:t>martain</w:t>
+      </w:r>
+      <w:proofErr w:type="spellEnd"/>
+      <w:r>
+        <w:rPr>
+          <w:rFonts w:ascii="Times New Roman" w:eastAsia="Times New Roman" w:hAnsi="Times New Roman" w:cs="Times New Roman"/>
+          <w:color w:val="000000"/>
+          <w:sz w:val="24"/>
+          <w:szCs w:val="24"/>
+        </w:rPr>
+        <w:t xml:space="preserve">). It’s suggested as more a nature consequence by </w:t>
+      </w:r>
+      <w:proofErr w:type="spellStart"/>
+      <w:r>
+        <w:rPr>
+          <w:rFonts w:ascii="Times New Roman" w:eastAsia="Times New Roman" w:hAnsi="Times New Roman" w:cs="Times New Roman"/>
+          <w:color w:val="000000"/>
+          <w:sz w:val="24"/>
+          <w:szCs w:val="24"/>
+        </w:rPr>
+        <w:t>greger</w:t>
+      </w:r>
+      <w:proofErr w:type="spellEnd"/>
+      <w:r>
+        <w:rPr>
+          <w:rFonts w:ascii="Times New Roman" w:eastAsia="Times New Roman" w:hAnsi="Times New Roman" w:cs="Times New Roman"/>
+          <w:color w:val="000000"/>
+          <w:sz w:val="24"/>
+          <w:szCs w:val="24"/>
+        </w:rPr>
+        <w:t xml:space="preserve"> Larson et al. our founding that the domestic lineage before </w:t>
+      </w:r>
+      <w:proofErr w:type="spellStart"/>
+      <w:r>
+        <w:rPr>
+          <w:rFonts w:ascii="Times New Roman" w:eastAsia="Times New Roman" w:hAnsi="Times New Roman" w:cs="Times New Roman"/>
+          <w:color w:val="000000"/>
+          <w:sz w:val="24"/>
+          <w:szCs w:val="24"/>
+        </w:rPr>
+        <w:t>civilation</w:t>
+      </w:r>
+      <w:proofErr w:type="spellEnd"/>
+      <w:r>
+        <w:rPr>
+          <w:rFonts w:ascii="Times New Roman" w:eastAsia="Times New Roman" w:hAnsi="Times New Roman" w:cs="Times New Roman"/>
+          <w:color w:val="000000"/>
+          <w:sz w:val="24"/>
+          <w:szCs w:val="24"/>
+        </w:rPr>
+        <w:t xml:space="preserve"> </w:t>
+      </w:r>
+      <w:proofErr w:type="spellStart"/>
+      <w:r>
+        <w:rPr>
+          <w:rFonts w:ascii="Times New Roman" w:eastAsia="Times New Roman" w:hAnsi="Times New Roman" w:cs="Times New Roman"/>
+          <w:color w:val="000000"/>
+          <w:sz w:val="24"/>
+          <w:szCs w:val="24"/>
+        </w:rPr>
+        <w:t>supporte</w:t>
+      </w:r>
+      <w:proofErr w:type="spellEnd"/>
+      <w:r>
+        <w:rPr>
+          <w:rFonts w:ascii="Times New Roman" w:eastAsia="Times New Roman" w:hAnsi="Times New Roman" w:cs="Times New Roman"/>
+          <w:color w:val="000000"/>
+          <w:sz w:val="24"/>
+          <w:szCs w:val="24"/>
+        </w:rPr>
+        <w:t xml:space="preserve"> this idea. Meanwhile recent research also </w:t>
+      </w:r>
+      <w:proofErr w:type="spellStart"/>
+      <w:r>
+        <w:rPr>
+          <w:rFonts w:ascii="Times New Roman" w:eastAsia="Times New Roman" w:hAnsi="Times New Roman" w:cs="Times New Roman"/>
+          <w:color w:val="000000"/>
+          <w:sz w:val="24"/>
+          <w:szCs w:val="24"/>
+        </w:rPr>
+        <w:t>suggenst</w:t>
+      </w:r>
+      <w:proofErr w:type="spellEnd"/>
+      <w:r>
+        <w:rPr>
+          <w:rFonts w:ascii="Times New Roman" w:eastAsia="Times New Roman" w:hAnsi="Times New Roman" w:cs="Times New Roman"/>
+          <w:color w:val="000000"/>
+          <w:sz w:val="24"/>
+          <w:szCs w:val="24"/>
+        </w:rPr>
+        <w:t xml:space="preserve"> that the critical changes at only a few domestication loci may not the true, instead many mutations of small effect, especially those frequency </w:t>
       </w:r>
       <w:r>
         <w:rPr>
@@ -1636,16 +2201,78 @@
           <w:sz w:val="24"/>
           <w:szCs w:val="24"/>
         </w:rPr>
-        <w:t>More explicit some different kind of domestic trait may consitiute on the context that supplied by nature.</w:t>
-      </w:r>
+        <w:t xml:space="preserve">More explicit some different kind of domestic trait may </w:t>
+      </w:r>
+      <w:proofErr w:type="spellStart"/>
       <w:r>
         <w:rPr>
           <w:rFonts w:ascii="Times New Roman" w:eastAsia="Times New Roman" w:hAnsi="Times New Roman" w:cs="Times New Roman"/>
-          <w:color w:val="000000"/>
-          <w:sz w:val="24"/>
-          <w:szCs w:val="24"/>
-        </w:rPr>
-        <w:t xml:space="preserve"> In addition researches on flightless also reveal different mechanisms underlying different case. The evolution context may should be highlight for those functional studies. Our research may provide a case to further illustrate both the domestication and flightless process were long-term evolution, longer than our expectation. surprised found the longer evolutionary history than expected further supported the important of evolutionary context.  both domestication and evolution of flight  It seems all those process which domestication and flight/flightless evolution were long-term evolutionary for  </w:t>
+          <w:strike/>
+          <w:color w:val="000000"/>
+          <w:sz w:val="24"/>
+          <w:szCs w:val="24"/>
+        </w:rPr>
+        <w:t>consitiute</w:t>
+      </w:r>
+      <w:proofErr w:type="spellEnd"/>
+      <w:r>
+        <w:rPr>
+          <w:rFonts w:ascii="Times New Roman" w:eastAsia="Times New Roman" w:hAnsi="Times New Roman" w:cs="Times New Roman"/>
+          <w:strike/>
+          <w:color w:val="000000"/>
+          <w:sz w:val="24"/>
+          <w:szCs w:val="24"/>
+        </w:rPr>
+        <w:t xml:space="preserve"> on the context that supplied by nature.</w:t>
+      </w:r>
+      <w:r>
+        <w:rPr>
+          <w:rFonts w:ascii="Times New Roman" w:eastAsia="Times New Roman" w:hAnsi="Times New Roman" w:cs="Times New Roman"/>
+          <w:color w:val="000000"/>
+          <w:sz w:val="24"/>
+          <w:szCs w:val="24"/>
+        </w:rPr>
+        <w:t xml:space="preserve"> In </w:t>
+      </w:r>
+      <w:proofErr w:type="gramStart"/>
+      <w:r>
+        <w:rPr>
+          <w:rFonts w:ascii="Times New Roman" w:eastAsia="Times New Roman" w:hAnsi="Times New Roman" w:cs="Times New Roman"/>
+          <w:color w:val="000000"/>
+          <w:sz w:val="24"/>
+          <w:szCs w:val="24"/>
+        </w:rPr>
+        <w:t>addition</w:t>
+      </w:r>
+      <w:proofErr w:type="gramEnd"/>
+      <w:r>
+        <w:rPr>
+          <w:rFonts w:ascii="Times New Roman" w:eastAsia="Times New Roman" w:hAnsi="Times New Roman" w:cs="Times New Roman"/>
+          <w:color w:val="000000"/>
+          <w:sz w:val="24"/>
+          <w:szCs w:val="24"/>
+        </w:rPr>
+        <w:t xml:space="preserve"> researches on flightless also reveal different mechanisms underlying different case. The evolution context may should be highlight for those functional studies. Our research may provide a case to further illustrate both the domestication and flightless process were long-term evolution, longer than our expectation. surprised found the longer evolutionary history than expected further supported the important of evolutionary context.  both domestication and evolution of </w:t>
+      </w:r>
+      <w:proofErr w:type="gramStart"/>
+      <w:r>
+        <w:rPr>
+          <w:rFonts w:ascii="Times New Roman" w:eastAsia="Times New Roman" w:hAnsi="Times New Roman" w:cs="Times New Roman"/>
+          <w:color w:val="000000"/>
+          <w:sz w:val="24"/>
+          <w:szCs w:val="24"/>
+        </w:rPr>
+        <w:t>flight  It</w:t>
+      </w:r>
+      <w:proofErr w:type="gramEnd"/>
+      <w:r>
+        <w:rPr>
+          <w:rFonts w:ascii="Times New Roman" w:eastAsia="Times New Roman" w:hAnsi="Times New Roman" w:cs="Times New Roman"/>
+          <w:color w:val="000000"/>
+          <w:sz w:val="24"/>
+          <w:szCs w:val="24"/>
+        </w:rPr>
+        <w:t xml:space="preserve"> seems all those process which domestication and flight/flightless evolution were long-term evolutionary for  </w:t>
       </w:r>
     </w:p>
     <w:p>
@@ -1780,14 +2407,25 @@
         </w:rPr>
         <w:t xml:space="preserve"> ; </w:t>
       </w:r>
-      <w:r>
-        <w:rPr>
-          <w:rFonts w:ascii="Arial" w:hAnsi="Arial" w:cs="Arial"/>
-          <w:color w:val="313083"/>
-          <w:sz w:val="20"/>
-          <w:szCs w:val="20"/>
-        </w:rPr>
-        <w:t>梅应琪译</w:t>
+      <w:proofErr w:type="gramStart"/>
+      <w:r>
+        <w:rPr>
+          <w:rFonts w:ascii="Arial" w:hAnsi="Arial" w:cs="Arial"/>
+          <w:color w:val="313083"/>
+          <w:sz w:val="20"/>
+          <w:szCs w:val="20"/>
+        </w:rPr>
+        <w:t>梅应琪</w:t>
+      </w:r>
+      <w:proofErr w:type="gramEnd"/>
+      <w:r>
+        <w:rPr>
+          <w:rFonts w:ascii="Arial" w:hAnsi="Arial" w:cs="Arial"/>
+          <w:color w:val="313083"/>
+          <w:sz w:val="20"/>
+          <w:szCs w:val="20"/>
+        </w:rPr>
+        <w:t>译</w:t>
       </w:r>
       <w:r>
         <w:rPr>
@@ -1823,7 +2461,27 @@
           <w:sz w:val="20"/>
           <w:szCs w:val="20"/>
         </w:rPr>
-        <w:t>台湾东贩股份有限</w:t>
+        <w:t>台湾东</w:t>
+      </w:r>
+      <w:proofErr w:type="gramStart"/>
+      <w:r>
+        <w:rPr>
+          <w:rFonts w:ascii="Arial" w:hAnsi="Arial" w:cs="Arial"/>
+          <w:color w:val="313083"/>
+          <w:sz w:val="20"/>
+          <w:szCs w:val="20"/>
+        </w:rPr>
+        <w:t>贩股份</w:t>
+      </w:r>
+      <w:proofErr w:type="gramEnd"/>
+      <w:r>
+        <w:rPr>
+          <w:rFonts w:ascii="Arial" w:hAnsi="Arial" w:cs="Arial"/>
+          <w:color w:val="313083"/>
+          <w:sz w:val="20"/>
+          <w:szCs w:val="20"/>
+        </w:rPr>
+        <w:t>有限</w:t>
       </w:r>
     </w:p>
     <w:p>
@@ -2004,7 +2662,27 @@
           <w:color w:val="313083"/>
           <w:szCs w:val="21"/>
         </w:rPr>
-        <w:t xml:space="preserve">Flight ways : life and loss at the edge of extinction  </w:t>
+        <w:t xml:space="preserve">Flight </w:t>
+      </w:r>
+      <w:proofErr w:type="gramStart"/>
+      <w:r>
+        <w:rPr>
+          <w:rFonts w:ascii="Arial" w:hAnsi="Arial" w:cs="Arial"/>
+          <w:strike/>
+          <w:color w:val="313083"/>
+          <w:szCs w:val="21"/>
+        </w:rPr>
+        <w:t>ways :</w:t>
+      </w:r>
+      <w:proofErr w:type="gramEnd"/>
+      <w:r>
+        <w:rPr>
+          <w:rFonts w:ascii="Arial" w:hAnsi="Arial" w:cs="Arial"/>
+          <w:strike/>
+          <w:color w:val="313083"/>
+          <w:szCs w:val="21"/>
+        </w:rPr>
+        <w:t xml:space="preserve"> life and loss at the edge of extinction  </w:t>
       </w:r>
     </w:p>
     <w:p>
@@ -2076,7 +2754,29 @@
           <w:sz w:val="20"/>
           <w:szCs w:val="20"/>
         </w:rPr>
-        <w:t xml:space="preserve">The inner bird : anatomy and evolution  </w:t>
+        <w:t xml:space="preserve">The inner </w:t>
+      </w:r>
+      <w:proofErr w:type="gramStart"/>
+      <w:r>
+        <w:rPr>
+          <w:rFonts w:ascii="Arial" w:hAnsi="Arial" w:cs="Arial"/>
+          <w:strike/>
+          <w:color w:val="313083"/>
+          <w:sz w:val="20"/>
+          <w:szCs w:val="20"/>
+        </w:rPr>
+        <w:t>bird :</w:t>
+      </w:r>
+      <w:proofErr w:type="gramEnd"/>
+      <w:r>
+        <w:rPr>
+          <w:rFonts w:ascii="Arial" w:hAnsi="Arial" w:cs="Arial"/>
+          <w:strike/>
+          <w:color w:val="313083"/>
+          <w:sz w:val="20"/>
+          <w:szCs w:val="20"/>
+        </w:rPr>
+        <w:t xml:space="preserve"> anatomy and evolution  </w:t>
       </w:r>
     </w:p>
     <w:p>
@@ -2622,8 +3322,9 @@
           <w:sz w:val="24"/>
           <w:szCs w:val="24"/>
         </w:rPr>
-        <w:t>pigeon33 (C. livia) and chicken (G. gallus), in which we expect there to</w:t>
-      </w:r>
+        <w:t xml:space="preserve">pigeon33 (C. </w:t>
+      </w:r>
+      <w:proofErr w:type="spellStart"/>
       <w:r>
         <w:rPr>
           <w:rFonts w:ascii="宋体" w:eastAsia="宋体" w:hAnsi="宋体" w:cs="Times New Roman"/>
@@ -2631,8 +3332,9 @@
           <w:sz w:val="24"/>
           <w:szCs w:val="24"/>
         </w:rPr>
-        <w:t xml:space="preserve"> </w:t>
-      </w:r>
+        <w:t>livia</w:t>
+      </w:r>
+      <w:proofErr w:type="spellEnd"/>
       <w:r>
         <w:rPr>
           <w:rFonts w:ascii="宋体" w:eastAsia="宋体" w:hAnsi="宋体" w:cs="Times New Roman"/>
@@ -2640,7 +3342,7 @@
           <w:sz w:val="24"/>
           <w:szCs w:val="24"/>
         </w:rPr>
-        <w:t>have been less evolutionary pressure to optimize any light-dependent</w:t>
+        <w:t>) and chicken (G. gallus), in which we expect there to</w:t>
       </w:r>
       <w:r>
         <w:rPr>
@@ -2658,7 +3360,7 @@
           <w:sz w:val="24"/>
           <w:szCs w:val="24"/>
         </w:rPr>
-        <w:t>magnetic compass sense.</w:t>
+        <w:t>have been less evolutionary pressure to optimize any light-dependent</w:t>
       </w:r>
       <w:r>
         <w:rPr>
@@ -2669,15 +3371,33 @@
         </w:rPr>
         <w:t xml:space="preserve"> </w:t>
       </w:r>
-    </w:p>
-    <w:p>
-      <w:pPr>
+      <w:r>
         <w:rPr>
           <w:rFonts w:ascii="宋体" w:eastAsia="宋体" w:hAnsi="宋体" w:cs="Times New Roman"/>
           <w:color w:val="000000" w:themeColor="text1"/>
           <w:sz w:val="24"/>
           <w:szCs w:val="24"/>
         </w:rPr>
+        <w:t>magnetic compass sense.</w:t>
+      </w:r>
+      <w:r>
+        <w:rPr>
+          <w:rFonts w:ascii="宋体" w:eastAsia="宋体" w:hAnsi="宋体" w:cs="Times New Roman"/>
+          <w:color w:val="000000" w:themeColor="text1"/>
+          <w:sz w:val="24"/>
+          <w:szCs w:val="24"/>
+        </w:rPr>
+        <w:t xml:space="preserve"> </w:t>
+      </w:r>
+    </w:p>
+    <w:p>
+      <w:pPr>
+        <w:rPr>
+          <w:rFonts w:ascii="宋体" w:eastAsia="宋体" w:hAnsi="宋体" w:cs="Times New Roman"/>
+          <w:color w:val="000000" w:themeColor="text1"/>
+          <w:sz w:val="24"/>
+          <w:szCs w:val="24"/>
+        </w:rPr>
       </w:pPr>
       <w:r>
         <w:rPr>
@@ -2686,13 +3406,33 @@
           <w:sz w:val="24"/>
           <w:szCs w:val="24"/>
         </w:rPr>
-        <w:t>或者关注我发现受选择的可能和磁感应相关的基因是否与这个基因有关系。</w:t>
-      </w:r>
-    </w:p>
-    <w:p>
-      <w:pPr>
+        <w:t>或者关注我发现</w:t>
+      </w:r>
+      <w:proofErr w:type="gramStart"/>
+      <w:r>
         <w:rPr>
           <w:rFonts w:ascii="宋体" w:eastAsia="宋体" w:hAnsi="宋体" w:cs="Times New Roman" w:hint="eastAsia"/>
+          <w:color w:val="000000" w:themeColor="text1"/>
+          <w:sz w:val="24"/>
+          <w:szCs w:val="24"/>
+        </w:rPr>
+        <w:t>受选择</w:t>
+      </w:r>
+      <w:proofErr w:type="gramEnd"/>
+      <w:r>
+        <w:rPr>
+          <w:rFonts w:ascii="宋体" w:eastAsia="宋体" w:hAnsi="宋体" w:cs="Times New Roman" w:hint="eastAsia"/>
+          <w:color w:val="000000" w:themeColor="text1"/>
+          <w:sz w:val="24"/>
+          <w:szCs w:val="24"/>
+        </w:rPr>
+        <w:t>的可能和磁感应相关的基因是否与这个基因有关系。</w:t>
+      </w:r>
+    </w:p>
+    <w:p>
+      <w:pPr>
+        <w:rPr>
+          <w:rFonts w:ascii="宋体" w:eastAsia="宋体" w:hAnsi="宋体" w:cs="Times New Roman"/>
           <w:color w:val="000000" w:themeColor="text1"/>
           <w:sz w:val="24"/>
           <w:szCs w:val="24"/>

</xml_diff>